<commit_message>
Update draft 8 with published details for Crowley 2026 and Kelly 2026
Both papers are now out in J Anim Sci 104; the relinked EndNote file and
the live doc's reference list now carry their volumes and article numbers.

Co-Authored-By: Claude Opus 5.5 <noreply@anthropic.com>
Claude-Session: https://claude.ai/code/session_01KJp9Dx3gp3DvgzDMma27iS
</commit_message>
<xml_diff>
--- a/manuscript/revised/Methane_manuscript_draft8.docx
+++ b/manuscript/revised/Methane_manuscript_draft8.docx
@@ -35,15 +35,7 @@
         <w:pStyle w:val="Affiliations"/>
       </w:pPr>
       <w:r>
-        <w:t xml:space="preserve">² Department of Biological Sciences, Munster Technological University, </w:t>
-      </w:r>
-      <w:proofErr w:type="spellStart"/>
-      <w:r>
-        <w:t>Bishopstown</w:t>
-      </w:r>
-      <w:proofErr w:type="spellEnd"/>
-      <w:r>
-        <w:t>, Co. Cork T12 P928, Ireland</w:t>
+        <w:t>² Department of Biological Sciences, Munster Technological University, Bishopstown, Co. Cork T12 P928, Ireland</w:t>
       </w:r>
     </w:p>
     <w:p>
@@ -113,23 +105,7 @@
         <w:t>Alternative methane traits were defined as ratios of methane relative to metabolic body weight (MBW), average daily gain (ADG), muscle mass and rumen volume, and as residuals of methane regressed on these traits.</w:t>
       </w:r>
       <w:r>
-        <w:t xml:space="preserve"> Heritability estimates ranged from 0.12 to 0.46. Daily methane was positively genetically correlated with MBW (</w:t>
-      </w:r>
-      <w:proofErr w:type="spellStart"/>
-      <w:r>
-        <w:t>rg</w:t>
-      </w:r>
-      <w:proofErr w:type="spellEnd"/>
-      <w:r>
-        <w:t xml:space="preserve"> = 0.72), live weight (0.71) and ADG (0.51). Ratio and residual definitions were negatively genetically correlated with their denominator or adjustment traits, while the residual traits remained strongly genetically correlated with absolute methane (</w:t>
-      </w:r>
-      <w:proofErr w:type="spellStart"/>
-      <w:r>
-        <w:t>rg</w:t>
-      </w:r>
-      <w:proofErr w:type="spellEnd"/>
-      <w:r>
-        <w:t xml:space="preserve"> = 0.78–1.00). In a selection index of CH₄, MBW and carbon dioxide (CO₂), a favourable response, reducing methane by 0.61 g day⁻¹ with no decline in MBW or CO₂, was reached from every methane trait once appropriate weights on MBW and CO₂ were included in the breeding goal, so the weighting rather than the trait definition determined the outcome.</w:t>
+        <w:t xml:space="preserve"> Heritability estimates ranged from 0.12 to 0.46. Daily methane was positively genetically correlated with MBW (rg = 0.72), live weight (0.71) and ADG (0.51). Ratio and residual definitions were negatively genetically correlated with their denominator or adjustment traits, while the residual traits remained strongly genetically correlated with absolute methane (rg = 0.78–1.00). In a selection index of CH₄, MBW and carbon dioxide (CO₂), a favourable response, reducing methane by 0.61 g day⁻¹ with no decline in MBW or CO₂, was reached from every methane trait once appropriate weights on MBW and CO₂ were included in the breeding goal, so the weighting rather than the trait definition determined the outcome.</w:t>
       </w:r>
     </w:p>
     <w:p>
@@ -671,7 +647,7 @@
       </w:r>
       <w:r>
         <w:fldChar w:fldCharType="begin">
-          <w:fldData xml:space="preserve">PEVuZE5vdGU+PENpdGU+PEF1dGhvcj5Hb29weTwvQXV0aG9yPjxZZWFyPjIwMTU8L1llYXI+PFJl
+          <w:fldData xml:space="preserve">PEVuZE5vdGU+PENpdGU+PEF1dGhvcj5Hb29weTwvQXV0aG9yPjxZZWFyPjIwMTY8L1llYXI+PFJl
 Y051bT4yMzA8L1JlY051bT48RGlzcGxheVRleHQ+WzEyLCAxM108L0Rpc3BsYXlUZXh0PjxyZWNv
 cmQ+PHJlYy1udW1iZXI+MjMwPC9yZWMtbnVtYmVyPjxmb3JlaWduLWtleXM+PGtleSBhcHA9IkVO
 IiBkYi1pZD0id2F4d3pwcnBkczVmOWRlczV6ZHhhNTVqenNwcHg1NWZwdzIwIiB0aW1lc3RhbXA9
@@ -687,7 +663,7 @@
 UHJvZHVjdGlvbiBTY2llbmNlPC9zZWNvbmRhcnktdGl0bGU+PC90aXRsZXM+PHBlcmlvZGljYWw+
 PGZ1bGwtdGl0bGU+QW5pbWFsIFByb2R1Y3Rpb24gU2NpZW5jZTwvZnVsbC10aXRsZT48L3Blcmlv
 ZGljYWw+PHBhZ2VzPjExNi0xMjI8L3BhZ2VzPjx2b2x1bWU+NTY8L3ZvbHVtZT48ZGF0ZXM+PHll
-YXI+MjAxNTwveWVhcj48cHViLWRhdGVzPjxkYXRlPjAyLzEyPC9kYXRlPjwvcHViLWRhdGVzPjwv
+YXI+MjAxNjwveWVhcj48cHViLWRhdGVzPjxkYXRlPjAyLzEyPC9kYXRlPjwvcHViLWRhdGVzPjwv
 ZGF0ZXM+PHVybHM+PC91cmxzPjxlbGVjdHJvbmljLXJlc291cmNlLW51bT4xMC4xMDcxL0FOMTMz
 NzA8L2VsZWN0cm9uaWMtcmVzb3VyY2UtbnVtPjwvcmVjb3JkPjwvQ2l0ZT48Q2l0ZT48QXV0aG9y
 PlJvYmluc29uPC9BdXRob3I+PFllYXI+MjAxNTwvWWVhcj48UmVjTnVtPjI3ODwvUmVjTnVtPjxy
@@ -717,7 +693,7 @@
       </w:r>
       <w:r>
         <w:fldChar w:fldCharType="begin">
-          <w:fldData xml:space="preserve">PEVuZE5vdGU+PENpdGU+PEF1dGhvcj5Hb29weTwvQXV0aG9yPjxZZWFyPjIwMTU8L1llYXI+PFJl
+          <w:fldData xml:space="preserve">PEVuZE5vdGU+PENpdGU+PEF1dGhvcj5Hb29weTwvQXV0aG9yPjxZZWFyPjIwMTY8L1llYXI+PFJl
 Y051bT4yMzA8L1JlY051bT48RGlzcGxheVRleHQ+WzEyLCAxM108L0Rpc3BsYXlUZXh0PjxyZWNv
 cmQ+PHJlYy1udW1iZXI+MjMwPC9yZWMtbnVtYmVyPjxmb3JlaWduLWtleXM+PGtleSBhcHA9IkVO
 IiBkYi1pZD0id2F4d3pwcnBkczVmOWRlczV6ZHhhNTVqenNwcHg1NWZwdzIwIiB0aW1lc3RhbXA9
@@ -733,7 +709,7 @@
 UHJvZHVjdGlvbiBTY2llbmNlPC9zZWNvbmRhcnktdGl0bGU+PC90aXRsZXM+PHBlcmlvZGljYWw+
 PGZ1bGwtdGl0bGU+QW5pbWFsIFByb2R1Y3Rpb24gU2NpZW5jZTwvZnVsbC10aXRsZT48L3Blcmlv
 ZGljYWw+PHBhZ2VzPjExNi0xMjI8L3BhZ2VzPjx2b2x1bWU+NTY8L3ZvbHVtZT48ZGF0ZXM+PHll
-YXI+MjAxNTwveWVhcj48cHViLWRhdGVzPjxkYXRlPjAyLzEyPC9kYXRlPjwvcHViLWRhdGVzPjwv
+YXI+MjAxNjwveWVhcj48cHViLWRhdGVzPjxkYXRlPjAyLzEyPC9kYXRlPjwvcHViLWRhdGVzPjwv
 ZGF0ZXM+PHVybHM+PC91cmxzPjxlbGVjdHJvbmljLXJlc291cmNlLW51bT4xMC4xMDcxL0FOMTMz
 NzA8L2VsZWN0cm9uaWMtcmVzb3VyY2UtbnVtPjwvcmVjb3JkPjwvQ2l0ZT48Q2l0ZT48QXV0aG9y
 PlJvYmluc29uPC9BdXRob3I+PFllYXI+MjAxNTwvWWVhcj48UmVjTnVtPjI3ODwvUmVjTnVtPjxy
@@ -822,7 +798,7 @@
 cmVzb3VyY2UtbnVtPjEwLjEwOTMvamFzL3NreTE4NzwvZWxlY3Ryb25pYy1yZXNvdXJjZS1udW0+
 PHJlbW90ZS1kYXRhYmFzZS1wcm92aWRlcj5OTE08L3JlbW90ZS1kYXRhYmFzZS1wcm92aWRlcj48
 bGFuZ3VhZ2U+ZW5nPC9sYW5ndWFnZT48L3JlY29yZD48L0NpdGU+PENpdGU+PEF1dGhvcj5Hb29w
-eTwvQXV0aG9yPjxZZWFyPjIwMTU8L1llYXI+PFJlY051bT4yMzA8L1JlY051bT48cmVjb3JkPjxy
+eTwvQXV0aG9yPjxZZWFyPjIwMTY8L1llYXI+PFJlY051bT4yMzA8L1JlY051bT48cmVjb3JkPjxy
 ZWMtbnVtYmVyPjIzMDwvcmVjLW51bWJlcj48Zm9yZWlnbi1rZXlzPjxrZXkgYXBwPSJFTiIgZGIt
 aWQ9IndheHd6cHJwZHM1ZjlkZXM1emR4YTU1anpzcHB4NTVmcHcyMCIgdGltZXN0YW1wPSIxNzc5
 Nzg0MzA1Ij4yMzA8L2tleT48L2ZvcmVpZ24ta2V5cz48cmVmLXR5cGUgbmFtZT0iSm91cm5hbCBB
@@ -837,7 +813,7 @@
 Y3Rpb24gU2NpZW5jZTwvc2Vjb25kYXJ5LXRpdGxlPjwvdGl0bGVzPjxwZXJpb2RpY2FsPjxmdWxs
 LXRpdGxlPkFuaW1hbCBQcm9kdWN0aW9uIFNjaWVuY2U8L2Z1bGwtdGl0bGU+PC9wZXJpb2RpY2Fs
 PjxwYWdlcz4xMTYtMTIyPC9wYWdlcz48dm9sdW1lPjU2PC92b2x1bWU+PGRhdGVzPjx5ZWFyPjIw
-MTU8L3llYXI+PHB1Yi1kYXRlcz48ZGF0ZT4wMi8xMjwvZGF0ZT48L3B1Yi1kYXRlcz48L2RhdGVz
+MTY8L3llYXI+PHB1Yi1kYXRlcz48ZGF0ZT4wMi8xMjwvZGF0ZT48L3B1Yi1kYXRlcz48L2RhdGVz
 Pjx1cmxzPjwvdXJscz48ZWxlY3Ryb25pYy1yZXNvdXJjZS1udW0+MTAuMTA3MS9BTjEzMzcwPC9l
 bGVjdHJvbmljLXJlc291cmNlLW51bT48L3JlY29yZD48L0NpdGU+PENpdGU+PEF1dGhvcj5XYWhp
 bnlhPC9BdXRob3I+PFllYXI+MjAyMjwvWWVhcj48UmVjTnVtPjI4MTwvUmVjTnVtPjxyZWNvcmQ+
@@ -912,7 +888,7 @@
 cmVzb3VyY2UtbnVtPjEwLjEwOTMvamFzL3NreTE4NzwvZWxlY3Ryb25pYy1yZXNvdXJjZS1udW0+
 PHJlbW90ZS1kYXRhYmFzZS1wcm92aWRlcj5OTE08L3JlbW90ZS1kYXRhYmFzZS1wcm92aWRlcj48
 bGFuZ3VhZ2U+ZW5nPC9sYW5ndWFnZT48L3JlY29yZD48L0NpdGU+PENpdGU+PEF1dGhvcj5Hb29w
-eTwvQXV0aG9yPjxZZWFyPjIwMTU8L1llYXI+PFJlY051bT4yMzA8L1JlY051bT48cmVjb3JkPjxy
+eTwvQXV0aG9yPjxZZWFyPjIwMTY8L1llYXI+PFJlY051bT4yMzA8L1JlY051bT48cmVjb3JkPjxy
 ZWMtbnVtYmVyPjIzMDwvcmVjLW51bWJlcj48Zm9yZWlnbi1rZXlzPjxrZXkgYXBwPSJFTiIgZGIt
 aWQ9IndheHd6cHJwZHM1ZjlkZXM1emR4YTU1anpzcHB4NTVmcHcyMCIgdGltZXN0YW1wPSIxNzc5
 Nzg0MzA1Ij4yMzA8L2tleT48L2ZvcmVpZ24ta2V5cz48cmVmLXR5cGUgbmFtZT0iSm91cm5hbCBB
@@ -927,7 +903,7 @@
 Y3Rpb24gU2NpZW5jZTwvc2Vjb25kYXJ5LXRpdGxlPjwvdGl0bGVzPjxwZXJpb2RpY2FsPjxmdWxs
 LXRpdGxlPkFuaW1hbCBQcm9kdWN0aW9uIFNjaWVuY2U8L2Z1bGwtdGl0bGU+PC9wZXJpb2RpY2Fs
 PjxwYWdlcz4xMTYtMTIyPC9wYWdlcz48dm9sdW1lPjU2PC92b2x1bWU+PGRhdGVzPjx5ZWFyPjIw
-MTU8L3llYXI+PHB1Yi1kYXRlcz48ZGF0ZT4wMi8xMjwvZGF0ZT48L3B1Yi1kYXRlcz48L2RhdGVz
+MTY8L3llYXI+PHB1Yi1kYXRlcz48ZGF0ZT4wMi8xMjwvZGF0ZT48L3B1Yi1kYXRlcz48L2RhdGVz
 Pjx1cmxzPjwvdXJscz48ZWxlY3Ryb25pYy1yZXNvdXJjZS1udW0+MTAuMTA3MS9BTjEzMzcwPC9l
 bGVjdHJvbmljLXJlc291cmNlLW51bT48L3JlY29yZD48L0NpdGU+PENpdGU+PEF1dGhvcj5XYWhp
 bnlhPC9BdXRob3I+PFllYXI+MjAyMjwvWWVhcj48UmVjTnVtPjI4MTwvUmVjTnVtPjxyZWNvcmQ+
@@ -975,15 +951,7 @@
         <w:fldChar w:fldCharType="end"/>
       </w:r>
       <w:r>
-        <w:t xml:space="preserve"> and genetically correlated with respiration chamber (RC) methane (</w:t>
-      </w:r>
-      <w:proofErr w:type="spellStart"/>
-      <w:r>
-        <w:t>rg</w:t>
-      </w:r>
-      <w:proofErr w:type="spellEnd"/>
-      <w:r>
-        <w:t xml:space="preserve"> = 0.62–1.00) </w:t>
+        <w:t xml:space="preserve"> and genetically correlated with respiration chamber (RC) methane (rg = 0.62–1.00) </w:t>
       </w:r>
       <w:r>
         <w:fldChar w:fldCharType="begin">
@@ -1587,31 +1555,32 @@
 b29yLWZlZCBncm93aW5nIGNhdHRsZTwvdGl0bGU+PHNlY29uZGFyeS10aXRsZT5Kb3VybmFsIG9m
 IEFuaW1hbCBTY2llbmNlPC9zZWNvbmRhcnktdGl0bGU+PC90aXRsZXM+PHBlcmlvZGljYWw+PGZ1
 bGwtdGl0bGU+Sm91cm5hbCBvZiBBbmltYWwgU2NpZW5jZTwvZnVsbC10aXRsZT48L3BlcmlvZGlj
-YWw+PHZvbHVtZT4xMDI8L3ZvbHVtZT48ZGF0ZXM+PHllYXI+MjAyNDwveWVhcj48L2RhdGVzPjxp
-c2JuPjE1MjUtMzE2MzwvaXNibj48dXJscz48cmVsYXRlZC11cmxzPjx1cmw+aHR0cHM6Ly9kb2ku
-b3JnLzEwLjEwOTMvamFzL3NrYWUzNDY8L3VybD48L3JlbGF0ZWQtdXJscz48L3VybHM+PGN1c3Rv
-bTE+c2thZTM0NjwvY3VzdG9tMT48ZWxlY3Ryb25pYy1yZXNvdXJjZS1udW0+MTAuMTA5My9qYXMv
-c2thZTM0NjwvZWxlY3Ryb25pYy1yZXNvdXJjZS1udW0+PGFjY2Vzcy1kYXRlPjIvMjcvMjAyNTwv
-YWNjZXNzLWRhdGU+PC9yZWNvcmQ+PC9DaXRlPjxDaXRlPjxBdXRob3I+Q3Jvd2xleTwvQXV0aG9y
-PjxZZWFyPjIwMjY8L1llYXI+PFJlY051bT4xNjk8L1JlY051bT48cmVjb3JkPjxyZWMtbnVtYmVy
-PjE2OTwvcmVjLW51bWJlcj48Zm9yZWlnbi1rZXlzPjxrZXkgYXBwPSJFTiIgZGItaWQ9IndheHd6
-cHJwZHM1ZjlkZXM1emR4YTU1anpzcHB4NTVmcHcyMCIgdGltZXN0YW1wPSIxNzcyMDE5MzQyIj4x
-Njk8L2tleT48L2ZvcmVpZ24ta2V5cz48cmVmLXR5cGUgbmFtZT0iSm91cm5hbCBBcnRpY2xlIj4x
-NzwvcmVmLXR5cGU+PGNvbnRyaWJ1dG9ycz48YXV0aG9ycz48YXV0aG9yPkNyb3dsZXksIFNlYW4g
-QjwvYXV0aG9yPjxhdXRob3I+UHVyZmllbGQsIERlaXJkcmUgQzwvYXV0aG9yPjxhdXRob3I+Q29u
-cm95LCBTdGVwaGVuIEI8L2F1dGhvcj48YXV0aG9yPktlbGx5LCBEYXZpZCBOPC9hdXRob3I+PGF1
-dGhvcj5FdmFucywgUm9zcyBEPC9hdXRob3I+PGF1dGhvcj5SeWFuLCBDbG9kYWdoIFY8L2F1dGhv
-cj48YXV0aG9yPkJlcnJ5LCBEb25hZ2ggUDwvYXV0aG9yPjwvYXV0aG9ycz48L2NvbnRyaWJ1dG9y
-cz48dGl0bGVzPjx0aXRsZT5HZW5ldGljIEluc2lnaHRzIGludG8gRW50ZXJpYyBNZXRoYW5lIEVt
-aXNzaW9ucyBpbiBJbmRvb3ItRmVkIEdyb3dpbmcgQ2F0dGxlPC90aXRsZT48c2Vjb25kYXJ5LXRp
-dGxlPkpvdXJuYWwgb2YgQW5pbWFsIFNjaWVuY2U8L3NlY29uZGFyeS10aXRsZT48L3RpdGxlcz48
-cGVyaW9kaWNhbD48ZnVsbC10aXRsZT5Kb3VybmFsIG9mIEFuaW1hbCBTY2llbmNlPC9mdWxsLXRp
-dGxlPjwvcGVyaW9kaWNhbD48ZGF0ZXM+PHllYXI+MjAyNjwveWVhcj48L2RhdGVzPjxpc2JuPjE1
-MjUtMzE2MzwvaXNibj48dXJscz48cmVsYXRlZC11cmxzPjx1cmw+aHR0cHM6Ly9kb2kub3JnLzEw
-LjEwOTMvamFzL3NrYWcwNDY8L3VybD48L3JlbGF0ZWQtdXJscz48L3VybHM+PGN1c3RvbTE+c2th
-ZzA0NjwvY3VzdG9tMT48ZWxlY3Ryb25pYy1yZXNvdXJjZS1udW0+MTAuMTA5My9qYXMvc2thZzA0
-NjwvZWxlY3Ryb25pYy1yZXNvdXJjZS1udW0+PGFjY2Vzcy1kYXRlPjIvMjUvMjAyNjwvYWNjZXNz
-LWRhdGU+PC9yZWNvcmQ+PC9DaXRlPjwvRW5kTm90ZT4A
+YWw+PHBhZ2VzPnNrYWUzNDY8L3BhZ2VzPjx2b2x1bWU+MTAyPC92b2x1bWU+PGRhdGVzPjx5ZWFy
+PjIwMjQ8L3llYXI+PC9kYXRlcz48aXNibj4xNTI1LTMxNjM8L2lzYm4+PHVybHM+PHJlbGF0ZWQt
+dXJscz48dXJsPmh0dHBzOi8vZG9pLm9yZy8xMC4xMDkzL2phcy9za2FlMzQ2PC91cmw+PC9yZWxh
+dGVkLXVybHM+PC91cmxzPjxjdXN0b20xPnNrYWUzNDY8L2N1c3RvbTE+PGVsZWN0cm9uaWMtcmVz
+b3VyY2UtbnVtPjEwLjEwOTMvamFzL3NrYWUzNDY8L2VsZWN0cm9uaWMtcmVzb3VyY2UtbnVtPjxh
+Y2Nlc3MtZGF0ZT4yLzI3LzIwMjU8L2FjY2Vzcy1kYXRlPjwvcmVjb3JkPjwvQ2l0ZT48Q2l0ZT48
+QXV0aG9yPkNyb3dsZXk8L0F1dGhvcj48WWVhcj4yMDI2PC9ZZWFyPjxSZWNOdW0+MTY5PC9SZWNO
+dW0+PHJlY29yZD48cmVjLW51bWJlcj4xNjk8L3JlYy1udW1iZXI+PGZvcmVpZ24ta2V5cz48a2V5
+IGFwcD0iRU4iIGRiLWlkPSJ3YXh3enBycGRzNWY5ZGVzNXpkeGE1NWp6c3BweDU1ZnB3MjAiIHRp
+bWVzdGFtcD0iMTc3MjAxOTM0MiI+MTY5PC9rZXk+PC9mb3JlaWduLWtleXM+PHJlZi10eXBlIG5h
+bWU9IkpvdXJuYWwgQXJ0aWNsZSI+MTc8L3JlZi10eXBlPjxjb250cmlidXRvcnM+PGF1dGhvcnM+
+PGF1dGhvcj5Dcm93bGV5LCBTZWFuIEI8L2F1dGhvcj48YXV0aG9yPlB1cmZpZWxkLCBEZWlyZHJl
+IEM8L2F1dGhvcj48YXV0aG9yPkNvbnJveSwgU3RlcGhlbiBCPC9hdXRob3I+PGF1dGhvcj5LZWxs
+eSwgRGF2aWQgTjwvYXV0aG9yPjxhdXRob3I+RXZhbnMsIFJvc3MgRDwvYXV0aG9yPjxhdXRob3I+
+UnlhbiwgQ2xvZGFnaCBWPC9hdXRob3I+PGF1dGhvcj5CZXJyeSwgRG9uYWdoIFA8L2F1dGhvcj48
+L2F1dGhvcnM+PC9jb250cmlidXRvcnM+PHRpdGxlcz48dGl0bGU+R2VuZXRpYyBJbnNpZ2h0cyBp
+bnRvIEVudGVyaWMgTWV0aGFuZSBFbWlzc2lvbnMgaW4gSW5kb29yLUZlZCBHcm93aW5nIENhdHRs
+ZTwvdGl0bGU+PHNlY29uZGFyeS10aXRsZT5Kb3VybmFsIG9mIEFuaW1hbCBTY2llbmNlPC9zZWNv
+bmRhcnktdGl0bGU+PC90aXRsZXM+PHBlcmlvZGljYWw+PGZ1bGwtdGl0bGU+Sm91cm5hbCBvZiBB
+bmltYWwgU2NpZW5jZTwvZnVsbC10aXRsZT48L3BlcmlvZGljYWw+PHBhZ2VzPnNrYWcwNDY8L3Bh
+Z2VzPjx2b2x1bWU+MTA0PC92b2x1bWU+PGRhdGVzPjx5ZWFyPjIwMjY8L3llYXI+PC9kYXRlcz48
+aXNibj4xNTI1LTMxNjM8L2lzYm4+PHVybHM+PHJlbGF0ZWQtdXJscz48dXJsPmh0dHBzOi8vZG9p
+Lm9yZy8xMC4xMDkzL2phcy9za2FnMDQ2PC91cmw+PC9yZWxhdGVkLXVybHM+PC91cmxzPjxjdXN0
+b20xPnNrYWcwNDY8L2N1c3RvbTE+PGVsZWN0cm9uaWMtcmVzb3VyY2UtbnVtPjEwLjEwOTMvamFz
+L3NrYWcwNDY8L2VsZWN0cm9uaWMtcmVzb3VyY2UtbnVtPjxhY2Nlc3MtZGF0ZT4yLzI1LzIwMjY8
+L2FjY2Vzcy1kYXRlPjwvcmVjb3JkPjwvQ2l0ZT48L0VuZE5vdGU+AG==
 </w:fldData>
         </w:fldChar>
       </w:r>
@@ -1685,31 +1654,32 @@
 b29yLWZlZCBncm93aW5nIGNhdHRsZTwvdGl0bGU+PHNlY29uZGFyeS10aXRsZT5Kb3VybmFsIG9m
 IEFuaW1hbCBTY2llbmNlPC9zZWNvbmRhcnktdGl0bGU+PC90aXRsZXM+PHBlcmlvZGljYWw+PGZ1
 bGwtdGl0bGU+Sm91cm5hbCBvZiBBbmltYWwgU2NpZW5jZTwvZnVsbC10aXRsZT48L3BlcmlvZGlj
-YWw+PHZvbHVtZT4xMDI8L3ZvbHVtZT48ZGF0ZXM+PHllYXI+MjAyNDwveWVhcj48L2RhdGVzPjxp
-c2JuPjE1MjUtMzE2MzwvaXNibj48dXJscz48cmVsYXRlZC11cmxzPjx1cmw+aHR0cHM6Ly9kb2ku
-b3JnLzEwLjEwOTMvamFzL3NrYWUzNDY8L3VybD48L3JlbGF0ZWQtdXJscz48L3VybHM+PGN1c3Rv
-bTE+c2thZTM0NjwvY3VzdG9tMT48ZWxlY3Ryb25pYy1yZXNvdXJjZS1udW0+MTAuMTA5My9qYXMv
-c2thZTM0NjwvZWxlY3Ryb25pYy1yZXNvdXJjZS1udW0+PGFjY2Vzcy1kYXRlPjIvMjcvMjAyNTwv
-YWNjZXNzLWRhdGU+PC9yZWNvcmQ+PC9DaXRlPjxDaXRlPjxBdXRob3I+Q3Jvd2xleTwvQXV0aG9y
-PjxZZWFyPjIwMjY8L1llYXI+PFJlY051bT4xNjk8L1JlY051bT48cmVjb3JkPjxyZWMtbnVtYmVy
-PjE2OTwvcmVjLW51bWJlcj48Zm9yZWlnbi1rZXlzPjxrZXkgYXBwPSJFTiIgZGItaWQ9IndheHd6
-cHJwZHM1ZjlkZXM1emR4YTU1anpzcHB4NTVmcHcyMCIgdGltZXN0YW1wPSIxNzcyMDE5MzQyIj4x
-Njk8L2tleT48L2ZvcmVpZ24ta2V5cz48cmVmLXR5cGUgbmFtZT0iSm91cm5hbCBBcnRpY2xlIj4x
-NzwvcmVmLXR5cGU+PGNvbnRyaWJ1dG9ycz48YXV0aG9ycz48YXV0aG9yPkNyb3dsZXksIFNlYW4g
-QjwvYXV0aG9yPjxhdXRob3I+UHVyZmllbGQsIERlaXJkcmUgQzwvYXV0aG9yPjxhdXRob3I+Q29u
-cm95LCBTdGVwaGVuIEI8L2F1dGhvcj48YXV0aG9yPktlbGx5LCBEYXZpZCBOPC9hdXRob3I+PGF1
-dGhvcj5FdmFucywgUm9zcyBEPC9hdXRob3I+PGF1dGhvcj5SeWFuLCBDbG9kYWdoIFY8L2F1dGhv
-cj48YXV0aG9yPkJlcnJ5LCBEb25hZ2ggUDwvYXV0aG9yPjwvYXV0aG9ycz48L2NvbnRyaWJ1dG9y
-cz48dGl0bGVzPjx0aXRsZT5HZW5ldGljIEluc2lnaHRzIGludG8gRW50ZXJpYyBNZXRoYW5lIEVt
-aXNzaW9ucyBpbiBJbmRvb3ItRmVkIEdyb3dpbmcgQ2F0dGxlPC90aXRsZT48c2Vjb25kYXJ5LXRp
-dGxlPkpvdXJuYWwgb2YgQW5pbWFsIFNjaWVuY2U8L3NlY29uZGFyeS10aXRsZT48L3RpdGxlcz48
-cGVyaW9kaWNhbD48ZnVsbC10aXRsZT5Kb3VybmFsIG9mIEFuaW1hbCBTY2llbmNlPC9mdWxsLXRp
-dGxlPjwvcGVyaW9kaWNhbD48ZGF0ZXM+PHllYXI+MjAyNjwveWVhcj48L2RhdGVzPjxpc2JuPjE1
-MjUtMzE2MzwvaXNibj48dXJscz48cmVsYXRlZC11cmxzPjx1cmw+aHR0cHM6Ly9kb2kub3JnLzEw
-LjEwOTMvamFzL3NrYWcwNDY8L3VybD48L3JlbGF0ZWQtdXJscz48L3VybHM+PGN1c3RvbTE+c2th
-ZzA0NjwvY3VzdG9tMT48ZWxlY3Ryb25pYy1yZXNvdXJjZS1udW0+MTAuMTA5My9qYXMvc2thZzA0
-NjwvZWxlY3Ryb25pYy1yZXNvdXJjZS1udW0+PGFjY2Vzcy1kYXRlPjIvMjUvMjAyNjwvYWNjZXNz
-LWRhdGU+PC9yZWNvcmQ+PC9DaXRlPjwvRW5kTm90ZT4A
+YWw+PHBhZ2VzPnNrYWUzNDY8L3BhZ2VzPjx2b2x1bWU+MTAyPC92b2x1bWU+PGRhdGVzPjx5ZWFy
+PjIwMjQ8L3llYXI+PC9kYXRlcz48aXNibj4xNTI1LTMxNjM8L2lzYm4+PHVybHM+PHJlbGF0ZWQt
+dXJscz48dXJsPmh0dHBzOi8vZG9pLm9yZy8xMC4xMDkzL2phcy9za2FlMzQ2PC91cmw+PC9yZWxh
+dGVkLXVybHM+PC91cmxzPjxjdXN0b20xPnNrYWUzNDY8L2N1c3RvbTE+PGVsZWN0cm9uaWMtcmVz
+b3VyY2UtbnVtPjEwLjEwOTMvamFzL3NrYWUzNDY8L2VsZWN0cm9uaWMtcmVzb3VyY2UtbnVtPjxh
+Y2Nlc3MtZGF0ZT4yLzI3LzIwMjU8L2FjY2Vzcy1kYXRlPjwvcmVjb3JkPjwvQ2l0ZT48Q2l0ZT48
+QXV0aG9yPkNyb3dsZXk8L0F1dGhvcj48WWVhcj4yMDI2PC9ZZWFyPjxSZWNOdW0+MTY5PC9SZWNO
+dW0+PHJlY29yZD48cmVjLW51bWJlcj4xNjk8L3JlYy1udW1iZXI+PGZvcmVpZ24ta2V5cz48a2V5
+IGFwcD0iRU4iIGRiLWlkPSJ3YXh3enBycGRzNWY5ZGVzNXpkeGE1NWp6c3BweDU1ZnB3MjAiIHRp
+bWVzdGFtcD0iMTc3MjAxOTM0MiI+MTY5PC9rZXk+PC9mb3JlaWduLWtleXM+PHJlZi10eXBlIG5h
+bWU9IkpvdXJuYWwgQXJ0aWNsZSI+MTc8L3JlZi10eXBlPjxjb250cmlidXRvcnM+PGF1dGhvcnM+
+PGF1dGhvcj5Dcm93bGV5LCBTZWFuIEI8L2F1dGhvcj48YXV0aG9yPlB1cmZpZWxkLCBEZWlyZHJl
+IEM8L2F1dGhvcj48YXV0aG9yPkNvbnJveSwgU3RlcGhlbiBCPC9hdXRob3I+PGF1dGhvcj5LZWxs
+eSwgRGF2aWQgTjwvYXV0aG9yPjxhdXRob3I+RXZhbnMsIFJvc3MgRDwvYXV0aG9yPjxhdXRob3I+
+UnlhbiwgQ2xvZGFnaCBWPC9hdXRob3I+PGF1dGhvcj5CZXJyeSwgRG9uYWdoIFA8L2F1dGhvcj48
+L2F1dGhvcnM+PC9jb250cmlidXRvcnM+PHRpdGxlcz48dGl0bGU+R2VuZXRpYyBJbnNpZ2h0cyBp
+bnRvIEVudGVyaWMgTWV0aGFuZSBFbWlzc2lvbnMgaW4gSW5kb29yLUZlZCBHcm93aW5nIENhdHRs
+ZTwvdGl0bGU+PHNlY29uZGFyeS10aXRsZT5Kb3VybmFsIG9mIEFuaW1hbCBTY2llbmNlPC9zZWNv
+bmRhcnktdGl0bGU+PC90aXRsZXM+PHBlcmlvZGljYWw+PGZ1bGwtdGl0bGU+Sm91cm5hbCBvZiBB
+bmltYWwgU2NpZW5jZTwvZnVsbC10aXRsZT48L3BlcmlvZGljYWw+PHBhZ2VzPnNrYWcwNDY8L3Bh
+Z2VzPjx2b2x1bWU+MTA0PC92b2x1bWU+PGRhdGVzPjx5ZWFyPjIwMjY8L3llYXI+PC9kYXRlcz48
+aXNibj4xNTI1LTMxNjM8L2lzYm4+PHVybHM+PHJlbGF0ZWQtdXJscz48dXJsPmh0dHBzOi8vZG9p
+Lm9yZy8xMC4xMDkzL2phcy9za2FnMDQ2PC91cmw+PC9yZWxhdGVkLXVybHM+PC91cmxzPjxjdXN0
+b20xPnNrYWcwNDY8L2N1c3RvbTE+PGVsZWN0cm9uaWMtcmVzb3VyY2UtbnVtPjEwLjEwOTMvamFz
+L3NrYWcwNDY8L2VsZWN0cm9uaWMtcmVzb3VyY2UtbnVtPjxhY2Nlc3MtZGF0ZT4yLzI1LzIwMjY8
+L2FjY2Vzcy1kYXRlPjwvcmVjb3JkPjwvQ2l0ZT48L0VuZE5vdGU+AG==
 </w:fldData>
         </w:fldChar>
       </w:r>
@@ -1759,33 +1729,34 @@
 dHMgaW4gaW5kb29yLWZlZCBncm93aW5nIGNhdHRsZTwvdGl0bGU+PHNlY29uZGFyeS10aXRsZT5K
 b3VybmFsIG9mIEFuaW1hbCBTY2llbmNlPC9zZWNvbmRhcnktdGl0bGU+PC90aXRsZXM+PHBlcmlv
 ZGljYWw+PGZ1bGwtdGl0bGU+Sm91cm5hbCBvZiBBbmltYWwgU2NpZW5jZTwvZnVsbC10aXRsZT48
-L3BlcmlvZGljYWw+PHZvbHVtZT4xMDI8L3ZvbHVtZT48ZGF0ZXM+PHllYXI+MjAyNDwveWVhcj48
-L2RhdGVzPjxpc2JuPjE1MjUtMzE2MzwvaXNibj48dXJscz48cmVsYXRlZC11cmxzPjx1cmw+aHR0
-cHM6Ly9kb2kub3JnLzEwLjEwOTMvamFzL3NrYWUzNDY8L3VybD48L3JlbGF0ZWQtdXJscz48L3Vy
-bHM+PGN1c3RvbTE+c2thZTM0NjwvY3VzdG9tMT48ZWxlY3Ryb25pYy1yZXNvdXJjZS1udW0+MTAu
-MTA5My9qYXMvc2thZTM0NjwvZWxlY3Ryb25pYy1yZXNvdXJjZS1udW0+PGFjY2Vzcy1kYXRlPjIv
-MjcvMjAyNTwvYWNjZXNzLWRhdGU+PC9yZWNvcmQ+PC9DaXRlPjxDaXRlPjxBdXRob3I+U21pdGg8
-L0F1dGhvcj48WWVhcj4yMDIxPC9ZZWFyPjxSZWNOdW0+Nzk8L1JlY051bT48cmVjb3JkPjxyZWMt
-bnVtYmVyPjc5PC9yZWMtbnVtYmVyPjxmb3JlaWduLWtleXM+PGtleSBhcHA9IkVOIiBkYi1pZD0i
-d2F4d3pwcnBkczVmOWRlczV6ZHhhNTVqenNwcHg1NWZwdzIwIiB0aW1lc3RhbXA9IjE3NDE3ODI2
-MDkiPjc5PC9rZXk+PC9mb3JlaWduLWtleXM+PHJlZi10eXBlIG5hbWU9IkpvdXJuYWwgQXJ0aWNs
-ZSI+MTc8L3JlZi10eXBlPjxjb250cmlidXRvcnM+PGF1dGhvcnM+PGF1dGhvcj5TbWl0aCwgUGF1
-bCBFPC9hdXRob3I+PGF1dGhvcj5XYXRlcnMsIFNpbmVhZCBNPC9hdXRob3I+PGF1dGhvcj5LZW5u
-eSwgRGF2aWQgQTwvYXV0aG9yPjxhdXRob3I+S2lyd2FuLCBTdHVhcnQgRjwvYXV0aG9yPjxhdXRo
-b3I+Q29ucm95LCBTdGVwaGVuPC9hdXRob3I+PGF1dGhvcj5LZWxseSwgQWxhbiBLPC9hdXRob3I+
-PC9hdXRob3JzPjwvY29udHJpYnV0b3JzPjx0aXRsZXM+PHRpdGxlPkVmZmVjdCBvZiBkaXZlcmdl
-bmNlIGluIHJlc2lkdWFsIG1ldGhhbmUgZW1pc3Npb25zIG9uIGZlZWQgaW50YWtlIGFuZCBlZmZp
-Y2llbmN5LCBncm93dGggYW5kIGNhcmNhc3MgcGVyZm9ybWFuY2UsIGFuZCBpbmRpY2VzIG9mIHJ1
-bWVuIGZlcm1lbnRhdGlvbiBhbmQgbWV0aGFuZSBlbWlzc2lvbnMgaW4gZmluaXNoaW5nIGJlZWYg
-Y2F0dGxlPC90aXRsZT48c2Vjb25kYXJ5LXRpdGxlPkpvdXJuYWwgb2YgQW5pbWFsIFNjaWVuY2U8
-L3NlY29uZGFyeS10aXRsZT48L3RpdGxlcz48cGVyaW9kaWNhbD48ZnVsbC10aXRsZT5Kb3VybmFs
-IG9mIEFuaW1hbCBTY2llbmNlPC9mdWxsLXRpdGxlPjwvcGVyaW9kaWNhbD48dm9sdW1lPjk5PC92
-b2x1bWU+PG51bWJlcj4xMTwvbnVtYmVyPjxkYXRlcz48eWVhcj4yMDIxPC95ZWFyPjwvZGF0ZXM+
-PGlzYm4+MTUyNS0zMTYzPC9pc2JuPjx1cmxzPjxyZWxhdGVkLXVybHM+PHVybD5odHRwczovL2Rv
-aS5vcmcvMTAuMTA5My9qYXMvc2thYjI3NTwvdXJsPjwvcmVsYXRlZC11cmxzPjwvdXJscz48Y3Vz
-dG9tMT5za2FiMjc1PC9jdXN0b20xPjxlbGVjdHJvbmljLXJlc291cmNlLW51bT4xMC4xMDkzL2ph
-cy9za2FiMjc1PC9lbGVjdHJvbmljLXJlc291cmNlLW51bT48YWNjZXNzLWRhdGU+My8xMi8yMDI1
-PC9hY2Nlc3MtZGF0ZT48L3JlY29yZD48L0NpdGU+PC9FbmROb3RlPgB=
+L3BlcmlvZGljYWw+PHBhZ2VzPnNrYWUzNDY8L3BhZ2VzPjx2b2x1bWU+MTAyPC92b2x1bWU+PGRh
+dGVzPjx5ZWFyPjIwMjQ8L3llYXI+PC9kYXRlcz48aXNibj4xNTI1LTMxNjM8L2lzYm4+PHVybHM+
+PHJlbGF0ZWQtdXJscz48dXJsPmh0dHBzOi8vZG9pLm9yZy8xMC4xMDkzL2phcy9za2FlMzQ2PC91
+cmw+PC9yZWxhdGVkLXVybHM+PC91cmxzPjxjdXN0b20xPnNrYWUzNDY8L2N1c3RvbTE+PGVsZWN0
+cm9uaWMtcmVzb3VyY2UtbnVtPjEwLjEwOTMvamFzL3NrYWUzNDY8L2VsZWN0cm9uaWMtcmVzb3Vy
+Y2UtbnVtPjxhY2Nlc3MtZGF0ZT4yLzI3LzIwMjU8L2FjY2Vzcy1kYXRlPjwvcmVjb3JkPjwvQ2l0
+ZT48Q2l0ZT48QXV0aG9yPlNtaXRoPC9BdXRob3I+PFllYXI+MjAyMTwvWWVhcj48UmVjTnVtPjc5
+PC9SZWNOdW0+PHJlY29yZD48cmVjLW51bWJlcj43OTwvcmVjLW51bWJlcj48Zm9yZWlnbi1rZXlz
+PjxrZXkgYXBwPSJFTiIgZGItaWQ9IndheHd6cHJwZHM1ZjlkZXM1emR4YTU1anpzcHB4NTVmcHcy
+MCIgdGltZXN0YW1wPSIxNzQxNzgyNjA5Ij43OTwva2V5PjwvZm9yZWlnbi1rZXlzPjxyZWYtdHlw
+ZSBuYW1lPSJKb3VybmFsIEFydGljbGUiPjE3PC9yZWYtdHlwZT48Y29udHJpYnV0b3JzPjxhdXRo
+b3JzPjxhdXRob3I+U21pdGgsIFBhdWwgRTwvYXV0aG9yPjxhdXRob3I+V2F0ZXJzLCBTaW5lYWQg
+TTwvYXV0aG9yPjxhdXRob3I+S2VubnksIERhdmlkIEE8L2F1dGhvcj48YXV0aG9yPktpcndhbiwg
+U3R1YXJ0IEY8L2F1dGhvcj48YXV0aG9yPkNvbnJveSwgU3RlcGhlbjwvYXV0aG9yPjxhdXRob3I+
+S2VsbHksIEFsYW4gSzwvYXV0aG9yPjwvYXV0aG9ycz48L2NvbnRyaWJ1dG9ycz48dGl0bGVzPjx0
+aXRsZT5FZmZlY3Qgb2YgZGl2ZXJnZW5jZSBpbiByZXNpZHVhbCBtZXRoYW5lIGVtaXNzaW9ucyBv
+biBmZWVkIGludGFrZSBhbmQgZWZmaWNpZW5jeSwgZ3Jvd3RoIGFuZCBjYXJjYXNzIHBlcmZvcm1h
+bmNlLCBhbmQgaW5kaWNlcyBvZiBydW1lbiBmZXJtZW50YXRpb24gYW5kIG1ldGhhbmUgZW1pc3Np
+b25zIGluIGZpbmlzaGluZyBiZWVmIGNhdHRsZTwvdGl0bGU+PHNlY29uZGFyeS10aXRsZT5Kb3Vy
+bmFsIG9mIEFuaW1hbCBTY2llbmNlPC9zZWNvbmRhcnktdGl0bGU+PC90aXRsZXM+PHBlcmlvZGlj
+YWw+PGZ1bGwtdGl0bGU+Sm91cm5hbCBvZiBBbmltYWwgU2NpZW5jZTwvZnVsbC10aXRsZT48L3Bl
+cmlvZGljYWw+PHZvbHVtZT45OTwvdm9sdW1lPjxudW1iZXI+MTE8L251bWJlcj48ZGF0ZXM+PHll
+YXI+MjAyMTwveWVhcj48L2RhdGVzPjxpc2JuPjE1MjUtMzE2MzwvaXNibj48dXJscz48cmVsYXRl
+ZC11cmxzPjx1cmw+aHR0cHM6Ly9kb2kub3JnLzEwLjEwOTMvamFzL3NrYWIyNzU8L3VybD48L3Jl
+bGF0ZWQtdXJscz48L3VybHM+PGN1c3RvbTE+c2thYjI3NTwvY3VzdG9tMT48ZWxlY3Ryb25pYy1y
+ZXNvdXJjZS1udW0+MTAuMTA5My9qYXMvc2thYjI3NTwvZWxlY3Ryb25pYy1yZXNvdXJjZS1udW0+
+PGFjY2Vzcy1kYXRlPjMvMTIvMjAyNTwvYWNjZXNzLWRhdGU+PC9yZWNvcmQ+PC9DaXRlPjwvRW5k
+Tm90ZT4A
 </w:fldData>
         </w:fldChar>
       </w:r>
@@ -1809,33 +1780,34 @@
 dHMgaW4gaW5kb29yLWZlZCBncm93aW5nIGNhdHRsZTwvdGl0bGU+PHNlY29uZGFyeS10aXRsZT5K
 b3VybmFsIG9mIEFuaW1hbCBTY2llbmNlPC9zZWNvbmRhcnktdGl0bGU+PC90aXRsZXM+PHBlcmlv
 ZGljYWw+PGZ1bGwtdGl0bGU+Sm91cm5hbCBvZiBBbmltYWwgU2NpZW5jZTwvZnVsbC10aXRsZT48
-L3BlcmlvZGljYWw+PHZvbHVtZT4xMDI8L3ZvbHVtZT48ZGF0ZXM+PHllYXI+MjAyNDwveWVhcj48
-L2RhdGVzPjxpc2JuPjE1MjUtMzE2MzwvaXNibj48dXJscz48cmVsYXRlZC11cmxzPjx1cmw+aHR0
-cHM6Ly9kb2kub3JnLzEwLjEwOTMvamFzL3NrYWUzNDY8L3VybD48L3JlbGF0ZWQtdXJscz48L3Vy
-bHM+PGN1c3RvbTE+c2thZTM0NjwvY3VzdG9tMT48ZWxlY3Ryb25pYy1yZXNvdXJjZS1udW0+MTAu
-MTA5My9qYXMvc2thZTM0NjwvZWxlY3Ryb25pYy1yZXNvdXJjZS1udW0+PGFjY2Vzcy1kYXRlPjIv
-MjcvMjAyNTwvYWNjZXNzLWRhdGU+PC9yZWNvcmQ+PC9DaXRlPjxDaXRlPjxBdXRob3I+U21pdGg8
-L0F1dGhvcj48WWVhcj4yMDIxPC9ZZWFyPjxSZWNOdW0+Nzk8L1JlY051bT48cmVjb3JkPjxyZWMt
-bnVtYmVyPjc5PC9yZWMtbnVtYmVyPjxmb3JlaWduLWtleXM+PGtleSBhcHA9IkVOIiBkYi1pZD0i
-d2F4d3pwcnBkczVmOWRlczV6ZHhhNTVqenNwcHg1NWZwdzIwIiB0aW1lc3RhbXA9IjE3NDE3ODI2
-MDkiPjc5PC9rZXk+PC9mb3JlaWduLWtleXM+PHJlZi10eXBlIG5hbWU9IkpvdXJuYWwgQXJ0aWNs
-ZSI+MTc8L3JlZi10eXBlPjxjb250cmlidXRvcnM+PGF1dGhvcnM+PGF1dGhvcj5TbWl0aCwgUGF1
-bCBFPC9hdXRob3I+PGF1dGhvcj5XYXRlcnMsIFNpbmVhZCBNPC9hdXRob3I+PGF1dGhvcj5LZW5u
-eSwgRGF2aWQgQTwvYXV0aG9yPjxhdXRob3I+S2lyd2FuLCBTdHVhcnQgRjwvYXV0aG9yPjxhdXRo
-b3I+Q29ucm95LCBTdGVwaGVuPC9hdXRob3I+PGF1dGhvcj5LZWxseSwgQWxhbiBLPC9hdXRob3I+
-PC9hdXRob3JzPjwvY29udHJpYnV0b3JzPjx0aXRsZXM+PHRpdGxlPkVmZmVjdCBvZiBkaXZlcmdl
-bmNlIGluIHJlc2lkdWFsIG1ldGhhbmUgZW1pc3Npb25zIG9uIGZlZWQgaW50YWtlIGFuZCBlZmZp
-Y2llbmN5LCBncm93dGggYW5kIGNhcmNhc3MgcGVyZm9ybWFuY2UsIGFuZCBpbmRpY2VzIG9mIHJ1
-bWVuIGZlcm1lbnRhdGlvbiBhbmQgbWV0aGFuZSBlbWlzc2lvbnMgaW4gZmluaXNoaW5nIGJlZWYg
-Y2F0dGxlPC90aXRsZT48c2Vjb25kYXJ5LXRpdGxlPkpvdXJuYWwgb2YgQW5pbWFsIFNjaWVuY2U8
-L3NlY29uZGFyeS10aXRsZT48L3RpdGxlcz48cGVyaW9kaWNhbD48ZnVsbC10aXRsZT5Kb3VybmFs
-IG9mIEFuaW1hbCBTY2llbmNlPC9mdWxsLXRpdGxlPjwvcGVyaW9kaWNhbD48dm9sdW1lPjk5PC92
-b2x1bWU+PG51bWJlcj4xMTwvbnVtYmVyPjxkYXRlcz48eWVhcj4yMDIxPC95ZWFyPjwvZGF0ZXM+
-PGlzYm4+MTUyNS0zMTYzPC9pc2JuPjx1cmxzPjxyZWxhdGVkLXVybHM+PHVybD5odHRwczovL2Rv
-aS5vcmcvMTAuMTA5My9qYXMvc2thYjI3NTwvdXJsPjwvcmVsYXRlZC11cmxzPjwvdXJscz48Y3Vz
-dG9tMT5za2FiMjc1PC9jdXN0b20xPjxlbGVjdHJvbmljLXJlc291cmNlLW51bT4xMC4xMDkzL2ph
-cy9za2FiMjc1PC9lbGVjdHJvbmljLXJlc291cmNlLW51bT48YWNjZXNzLWRhdGU+My8xMi8yMDI1
-PC9hY2Nlc3MtZGF0ZT48L3JlY29yZD48L0NpdGU+PC9FbmROb3RlPgB=
+L3BlcmlvZGljYWw+PHBhZ2VzPnNrYWUzNDY8L3BhZ2VzPjx2b2x1bWU+MTAyPC92b2x1bWU+PGRh
+dGVzPjx5ZWFyPjIwMjQ8L3llYXI+PC9kYXRlcz48aXNibj4xNTI1LTMxNjM8L2lzYm4+PHVybHM+
+PHJlbGF0ZWQtdXJscz48dXJsPmh0dHBzOi8vZG9pLm9yZy8xMC4xMDkzL2phcy9za2FlMzQ2PC91
+cmw+PC9yZWxhdGVkLXVybHM+PC91cmxzPjxjdXN0b20xPnNrYWUzNDY8L2N1c3RvbTE+PGVsZWN0
+cm9uaWMtcmVzb3VyY2UtbnVtPjEwLjEwOTMvamFzL3NrYWUzNDY8L2VsZWN0cm9uaWMtcmVzb3Vy
+Y2UtbnVtPjxhY2Nlc3MtZGF0ZT4yLzI3LzIwMjU8L2FjY2Vzcy1kYXRlPjwvcmVjb3JkPjwvQ2l0
+ZT48Q2l0ZT48QXV0aG9yPlNtaXRoPC9BdXRob3I+PFllYXI+MjAyMTwvWWVhcj48UmVjTnVtPjc5
+PC9SZWNOdW0+PHJlY29yZD48cmVjLW51bWJlcj43OTwvcmVjLW51bWJlcj48Zm9yZWlnbi1rZXlz
+PjxrZXkgYXBwPSJFTiIgZGItaWQ9IndheHd6cHJwZHM1ZjlkZXM1emR4YTU1anpzcHB4NTVmcHcy
+MCIgdGltZXN0YW1wPSIxNzQxNzgyNjA5Ij43OTwva2V5PjwvZm9yZWlnbi1rZXlzPjxyZWYtdHlw
+ZSBuYW1lPSJKb3VybmFsIEFydGljbGUiPjE3PC9yZWYtdHlwZT48Y29udHJpYnV0b3JzPjxhdXRo
+b3JzPjxhdXRob3I+U21pdGgsIFBhdWwgRTwvYXV0aG9yPjxhdXRob3I+V2F0ZXJzLCBTaW5lYWQg
+TTwvYXV0aG9yPjxhdXRob3I+S2VubnksIERhdmlkIEE8L2F1dGhvcj48YXV0aG9yPktpcndhbiwg
+U3R1YXJ0IEY8L2F1dGhvcj48YXV0aG9yPkNvbnJveSwgU3RlcGhlbjwvYXV0aG9yPjxhdXRob3I+
+S2VsbHksIEFsYW4gSzwvYXV0aG9yPjwvYXV0aG9ycz48L2NvbnRyaWJ1dG9ycz48dGl0bGVzPjx0
+aXRsZT5FZmZlY3Qgb2YgZGl2ZXJnZW5jZSBpbiByZXNpZHVhbCBtZXRoYW5lIGVtaXNzaW9ucyBv
+biBmZWVkIGludGFrZSBhbmQgZWZmaWNpZW5jeSwgZ3Jvd3RoIGFuZCBjYXJjYXNzIHBlcmZvcm1h
+bmNlLCBhbmQgaW5kaWNlcyBvZiBydW1lbiBmZXJtZW50YXRpb24gYW5kIG1ldGhhbmUgZW1pc3Np
+b25zIGluIGZpbmlzaGluZyBiZWVmIGNhdHRsZTwvdGl0bGU+PHNlY29uZGFyeS10aXRsZT5Kb3Vy
+bmFsIG9mIEFuaW1hbCBTY2llbmNlPC9zZWNvbmRhcnktdGl0bGU+PC90aXRsZXM+PHBlcmlvZGlj
+YWw+PGZ1bGwtdGl0bGU+Sm91cm5hbCBvZiBBbmltYWwgU2NpZW5jZTwvZnVsbC10aXRsZT48L3Bl
+cmlvZGljYWw+PHZvbHVtZT45OTwvdm9sdW1lPjxudW1iZXI+MTE8L251bWJlcj48ZGF0ZXM+PHll
+YXI+MjAyMTwveWVhcj48L2RhdGVzPjxpc2JuPjE1MjUtMzE2MzwvaXNibj48dXJscz48cmVsYXRl
+ZC11cmxzPjx1cmw+aHR0cHM6Ly9kb2kub3JnLzEwLjEwOTMvamFzL3NrYWIyNzU8L3VybD48L3Jl
+bGF0ZWQtdXJscz48L3VybHM+PGN1c3RvbTE+c2thYjI3NTwvY3VzdG9tMT48ZWxlY3Ryb25pYy1y
+ZXNvdXJjZS1udW0+MTAuMTA5My9qYXMvc2thYjI3NTwvZWxlY3Ryb25pYy1yZXNvdXJjZS1udW0+
+PGFjY2Vzcy1kYXRlPjMvMTIvMjAyNTwvYWNjZXNzLWRhdGU+PC9yZWNvcmQ+PC9DaXRlPjwvRW5k
+Tm90ZT4A
 </w:fldData>
         </w:fldChar>
       </w:r>
@@ -2004,7 +1976,7 @@
         <w:fldChar w:fldCharType="begin"/>
       </w:r>
       <w:r>
-        <w:instrText xml:space="preserve"> ADDIN EN.CITE &lt;EndNote&gt;&lt;Cite&gt;&lt;Author&gt;Kelly&lt;/Author&gt;&lt;Year&gt;2026&lt;/Year&gt;&lt;RecNum&gt;187&lt;/RecNum&gt;&lt;DisplayText&gt;[23]&lt;/DisplayText&gt;&lt;record&gt;&lt;rec-number&gt;187&lt;/rec-number&gt;&lt;foreign-keys&gt;&lt;key app="EN" db-id="waxwzprpds5f9des5zdxa55jzsppx55fpw20" timestamp="1778251468"&gt;187&lt;/key&gt;&lt;/foreign-keys&gt;&lt;ref-type name="Journal Article"&gt;17&lt;/ref-type&gt;&lt;contributors&gt;&lt;authors&gt;&lt;author&gt;Kelly, Dermot J&lt;/author&gt;&lt;author&gt;Mchugh, Nóirín&lt;/author&gt;&lt;author&gt;Purfield, Deirdre&lt;/author&gt;&lt;author&gt;Mccarron, Patrick&lt;/author&gt;&lt;author&gt;Pabiou, Thierry&lt;/author&gt;&lt;author&gt;Murphy, Craig&lt;/author&gt;&lt;author&gt;Mcgovern, Fiona&lt;/author&gt;&lt;/authors&gt;&lt;/contributors&gt;&lt;titles&gt;&lt;title&gt;Assessing alternative metrics of methane output measured in a multi-breed, pasture-based sheep population&lt;/title&gt;&lt;secondary-title&gt;Journal of Animal Science&lt;/secondary-title&gt;&lt;/titles&gt;&lt;periodical&gt;&lt;full-title&gt;Journal of Animal Science&lt;/full-title&gt;&lt;/periodical&gt;&lt;dates&gt;&lt;year&gt;2026&lt;/year&gt;&lt;/dates&gt;&lt;isbn&gt;1525-3163&lt;/isbn&gt;&lt;urls&gt;&lt;related-urls&gt;&lt;url&gt;https://doi.org/10.1093/jas/skag145&lt;/url&gt;&lt;/related-urls&gt;&lt;/urls&gt;&lt;custom1&gt;skag145&lt;/custom1&gt;&lt;electronic-resource-num&gt;10.1093/jas/skag145&lt;/electronic-resource-num&gt;&lt;access-date&gt;5/8/2026&lt;/access-date&gt;&lt;/record&gt;&lt;/Cite&gt;&lt;/EndNote&gt;</w:instrText>
+        <w:instrText xml:space="preserve"> ADDIN EN.CITE &lt;EndNote&gt;&lt;Cite&gt;&lt;Author&gt;Kelly&lt;/Author&gt;&lt;Year&gt;2026&lt;/Year&gt;&lt;RecNum&gt;187&lt;/RecNum&gt;&lt;DisplayText&gt;[23]&lt;/DisplayText&gt;&lt;record&gt;&lt;rec-number&gt;187&lt;/rec-number&gt;&lt;foreign-keys&gt;&lt;key app="EN" db-id="waxwzprpds5f9des5zdxa55jzsppx55fpw20" timestamp="1778251468"&gt;187&lt;/key&gt;&lt;/foreign-keys&gt;&lt;ref-type name="Journal Article"&gt;17&lt;/ref-type&gt;&lt;contributors&gt;&lt;authors&gt;&lt;author&gt;Kelly, Dermot J&lt;/author&gt;&lt;author&gt;McHugh, Nóirín&lt;/author&gt;&lt;author&gt;Purfield, Deirdre&lt;/author&gt;&lt;author&gt;McCarron, Patrick&lt;/author&gt;&lt;author&gt;Pabiou, Thierry&lt;/author&gt;&lt;author&gt;Murphy, Craig&lt;/author&gt;&lt;author&gt;McGovern, Fiona&lt;/author&gt;&lt;/authors&gt;&lt;/contributors&gt;&lt;titles&gt;&lt;title&gt;Assessing alternative metrics of methane output measured in a multi-breed, pasture-based sheep population&lt;/title&gt;&lt;secondary-title&gt;Journal of Animal Science&lt;/secondary-title&gt;&lt;/titles&gt;&lt;periodical&gt;&lt;full-title&gt;Journal of Animal Science&lt;/full-title&gt;&lt;/periodical&gt;&lt;pages&gt;skag145&lt;/pages&gt;&lt;volume&gt;104&lt;/volume&gt;&lt;dates&gt;&lt;year&gt;2026&lt;/year&gt;&lt;/dates&gt;&lt;isbn&gt;1525-3163&lt;/isbn&gt;&lt;urls&gt;&lt;related-urls&gt;&lt;url&gt;https://doi.org/10.1093/jas/skag145&lt;/url&gt;&lt;/related-urls&gt;&lt;/urls&gt;&lt;custom1&gt;skag145&lt;/custom1&gt;&lt;electronic-resource-num&gt;10.1093/jas/skag145&lt;/electronic-resource-num&gt;&lt;access-date&gt;5/8/2026&lt;/access-date&gt;&lt;/record&gt;&lt;/Cite&gt;&lt;/EndNote&gt;</w:instrText>
       </w:r>
       <w:r>
         <w:fldChar w:fldCharType="separate"/>
@@ -2110,15 +2082,7 @@
         <w:jc w:val="both"/>
       </w:pPr>
       <w:r>
-        <w:t xml:space="preserve">Measurements were collected across multiple physiological stages, including lambs (both sexes, 63 to 365 days of age; 5,564 records from 3,034 animals), hoggets (nulliparous females aged 365 to 600 days; 1,812 records from 1,271 animals), and mature ewes (females with a recorded lambing event aged 431 days to 10.5 years; 7,828 records from 4,327 animals). A total of 25.40% of animals had multiple methane records both within </w:t>
-      </w:r>
-      <w:proofErr w:type="gramStart"/>
-      <w:r>
-        <w:t>or</w:t>
-      </w:r>
-      <w:proofErr w:type="gramEnd"/>
-      <w:r>
-        <w:t xml:space="preserve"> across physiological stages.</w:t>
+        <w:t>Measurements were collected across multiple physiological stages, including lambs (both sexes, 63 to 365 days of age; 5,564 records from 3,034 animals), hoggets (nulliparous females aged 365 to 600 days; 1,812 records from 1,271 animals), and mature ewes (females with a recorded lambing event aged 431 days to 10.5 years; 7,828 records from 4,327 animals). A total of 25.40% of animals had multiple methane records both within or across physiological stages.</w:t>
       </w:r>
     </w:p>
     <w:p>
@@ -2154,15 +2118,7 @@
         <w:jc w:val="both"/>
       </w:pPr>
       <w:r>
-        <w:t xml:space="preserve">Live weight was recorded immediately prior to PAC measurement using a </w:t>
-      </w:r>
-      <w:proofErr w:type="spellStart"/>
-      <w:r>
-        <w:t>Prattley</w:t>
-      </w:r>
-      <w:proofErr w:type="spellEnd"/>
-      <w:r>
-        <w:t xml:space="preserve"> electronic weighing scale (O'Donovan Engineering Co. Ltd., Cork, Ireland) and was subjected to outlier removal (1.5 × interquartile range criterion). Metabolic body weight (live weight⁰·⁷⁵) was also </w:t>
+        <w:t xml:space="preserve">Live weight was recorded immediately prior to PAC measurement using a Prattley electronic weighing scale (O'Donovan Engineering Co. Ltd., Cork, Ireland) and was subjected to outlier removal (1.5 × interquartile range criterion). Metabolic body weight (live weight⁰·⁷⁵) was also </w:t>
       </w:r>
       <w:r>
         <w:lastRenderedPageBreak/>
@@ -2235,23 +2191,7 @@
         <w:jc w:val="both"/>
       </w:pPr>
       <w:r>
-        <w:t xml:space="preserve">Auxiliary data relating to animal age, breed composition, animal heterosis and recombination loss, and birth and rearing type were also available. The breed proportion of each animal for the six breeds with the greatest number of methane phenotypes (i.e., </w:t>
-      </w:r>
-      <w:proofErr w:type="spellStart"/>
-      <w:r>
-        <w:t>Belclare</w:t>
-      </w:r>
-      <w:proofErr w:type="spellEnd"/>
-      <w:r>
-        <w:t xml:space="preserve">, Charolais, Cheviot, Suffolk, </w:t>
-      </w:r>
-      <w:proofErr w:type="spellStart"/>
-      <w:r>
-        <w:t>Lleyn</w:t>
-      </w:r>
-      <w:proofErr w:type="spellEnd"/>
-      <w:r>
-        <w:t xml:space="preserve">, and Texel) was also calculated, together with the combined proportion </w:t>
+        <w:t xml:space="preserve">Auxiliary data relating to animal age, breed composition, animal heterosis and recombination loss, and birth and rearing type were also available. The breed proportion of each animal for the six breeds with the greatest number of methane phenotypes (i.e., Belclare, Charolais, Cheviot, Suffolk, Lleyn, and Texel) was also calculated, together with the combined proportion </w:t>
       </w:r>
       <w:r>
         <w:lastRenderedPageBreak/>
@@ -2383,15 +2323,30 @@
           <w:i/>
           <w:sz w:val="23"/>
         </w:rPr>
-        <w:t xml:space="preserve">het = 1 − </w:t>
-      </w:r>
-      <w:proofErr w:type="spellStart"/>
+        <w:t>het = 1 − Σ</w:t>
+      </w:r>
+      <w:r>
+        <w:rPr>
+          <w:i/>
+          <w:sz w:val="23"/>
+          <w:vertAlign w:val="subscript"/>
+        </w:rPr>
+        <w:t>i=1</w:t>
+      </w:r>
+      <w:r>
+        <w:rPr>
+          <w:i/>
+          <w:sz w:val="23"/>
+          <w:vertAlign w:val="superscript"/>
+        </w:rPr>
+        <w:t>n</w:t>
+      </w:r>
       <w:r>
         <w:rPr>
           <w:i/>
           <w:sz w:val="23"/>
         </w:rPr>
-        <w:t>Σ</w:t>
+        <w:t xml:space="preserve"> sire</w:t>
       </w:r>
       <w:r>
         <w:rPr>
@@ -2401,14 +2356,40 @@
         </w:rPr>
         <w:t>i</w:t>
       </w:r>
-      <w:proofErr w:type="spellEnd"/>
+      <w:r>
+        <w:rPr>
+          <w:i/>
+          <w:sz w:val="23"/>
+        </w:rPr>
+        <w:t xml:space="preserve"> × dam</w:t>
+      </w:r>
       <w:r>
         <w:rPr>
           <w:i/>
           <w:sz w:val="23"/>
           <w:vertAlign w:val="subscript"/>
         </w:rPr>
-        <w:t>=1</w:t>
+        <w:t>i</w:t>
+      </w:r>
+    </w:p>
+    <w:p>
+      <w:pPr>
+        <w:jc w:val="center"/>
+      </w:pPr>
+      <w:r>
+        <w:rPr>
+          <w:i/>
+          <w:sz w:val="23"/>
+        </w:rPr>
+        <w:t>rec = 1 − Σ</w:t>
+      </w:r>
+      <w:r>
+        <w:rPr>
+          <w:i/>
+          <w:sz w:val="23"/>
+          <w:vertAlign w:val="subscript"/>
+        </w:rPr>
+        <w:t>i=1</w:t>
       </w:r>
       <w:r>
         <w:rPr>
@@ -2423,15 +2404,7 @@
           <w:i/>
           <w:sz w:val="23"/>
         </w:rPr>
-        <w:t xml:space="preserve"> </w:t>
-      </w:r>
-      <w:proofErr w:type="spellStart"/>
-      <w:r>
-        <w:rPr>
-          <w:i/>
-          <w:sz w:val="23"/>
-        </w:rPr>
-        <w:t>sire</w:t>
+        <w:t xml:space="preserve"> (sire</w:t>
       </w:r>
       <w:r>
         <w:rPr>
@@ -2441,21 +2414,20 @@
         </w:rPr>
         <w:t>i</w:t>
       </w:r>
-      <w:proofErr w:type="spellEnd"/>
+      <w:r>
+        <w:rPr>
+          <w:i/>
+          <w:sz w:val="23"/>
+          <w:vertAlign w:val="superscript"/>
+        </w:rPr>
+        <w:t>2</w:t>
+      </w:r>
       <w:r>
         <w:rPr>
           <w:i/>
           <w:sz w:val="23"/>
         </w:rPr>
-        <w:t xml:space="preserve"> × </w:t>
-      </w:r>
-      <w:proofErr w:type="spellStart"/>
-      <w:r>
-        <w:rPr>
-          <w:i/>
-          <w:sz w:val="23"/>
-        </w:rPr>
-        <w:t>dam</w:t>
+        <w:t xml:space="preserve"> + dam</w:t>
       </w:r>
       <w:r>
         <w:rPr>
@@ -2465,67 +2437,6 @@
         </w:rPr>
         <w:t>i</w:t>
       </w:r>
-      <w:proofErr w:type="spellEnd"/>
-    </w:p>
-    <w:p>
-      <w:pPr>
-        <w:jc w:val="center"/>
-      </w:pPr>
-      <w:r>
-        <w:rPr>
-          <w:i/>
-          <w:sz w:val="23"/>
-        </w:rPr>
-        <w:t xml:space="preserve">rec = 1 − </w:t>
-      </w:r>
-      <w:proofErr w:type="spellStart"/>
-      <w:r>
-        <w:rPr>
-          <w:i/>
-          <w:sz w:val="23"/>
-        </w:rPr>
-        <w:t>Σ</w:t>
-      </w:r>
-      <w:r>
-        <w:rPr>
-          <w:i/>
-          <w:sz w:val="23"/>
-          <w:vertAlign w:val="subscript"/>
-        </w:rPr>
-        <w:t>i</w:t>
-      </w:r>
-      <w:proofErr w:type="spellEnd"/>
-      <w:r>
-        <w:rPr>
-          <w:i/>
-          <w:sz w:val="23"/>
-          <w:vertAlign w:val="subscript"/>
-        </w:rPr>
-        <w:t>=1</w:t>
-      </w:r>
-      <w:r>
-        <w:rPr>
-          <w:i/>
-          <w:sz w:val="23"/>
-          <w:vertAlign w:val="superscript"/>
-        </w:rPr>
-        <w:t>n</w:t>
-      </w:r>
-      <w:r>
-        <w:rPr>
-          <w:i/>
-          <w:sz w:val="23"/>
-        </w:rPr>
-        <w:t xml:space="preserve"> (sire</w:t>
-      </w:r>
-      <w:r>
-        <w:rPr>
-          <w:i/>
-          <w:sz w:val="23"/>
-          <w:vertAlign w:val="subscript"/>
-        </w:rPr>
-        <w:t>i</w:t>
-      </w:r>
       <w:r>
         <w:rPr>
           <w:i/>
@@ -2539,29 +2450,6 @@
           <w:i/>
           <w:sz w:val="23"/>
         </w:rPr>
-        <w:t xml:space="preserve"> + dam</w:t>
-      </w:r>
-      <w:r>
-        <w:rPr>
-          <w:i/>
-          <w:sz w:val="23"/>
-          <w:vertAlign w:val="subscript"/>
-        </w:rPr>
-        <w:t>i</w:t>
-      </w:r>
-      <w:r>
-        <w:rPr>
-          <w:i/>
-          <w:sz w:val="23"/>
-          <w:vertAlign w:val="superscript"/>
-        </w:rPr>
-        <w:t>2</w:t>
-      </w:r>
-      <w:r>
-        <w:rPr>
-          <w:i/>
-          <w:sz w:val="23"/>
-        </w:rPr>
         <w:t>) / 2</w:t>
       </w:r>
     </w:p>
@@ -2570,15 +2458,7 @@
         <w:jc w:val="both"/>
       </w:pPr>
       <w:r>
-        <w:t xml:space="preserve">where sireᵢ and damᵢ are the proportion of breed </w:t>
-      </w:r>
-      <w:proofErr w:type="spellStart"/>
-      <w:r>
-        <w:t>i</w:t>
-      </w:r>
-      <w:proofErr w:type="spellEnd"/>
-      <w:r>
-        <w:t xml:space="preserve"> in the sire and dam, respectively. For all growing animals the birth litter size (defined as whether the lamb was born as a single, twin, triplet or quadruplet), rearing litter size (defined as whether the lamb was reared as a single, twin or triplet), and dam parity (defined as 1, 2, 3, 4, 5, 6 or ≥7) were available. For ewes the birth and rearing type corresponding to the litter born to the ewe for the year of measurement were also available.</w:t>
+        <w:t>where sireᵢ and damᵢ are the proportion of breed i in the sire and dam, respectively. For all growing animals the birth litter size (defined as whether the lamb was born as a single, twin, triplet or quadruplet), rearing litter size (defined as whether the lamb was reared as a single, twin or triplet), and dam parity (defined as 1, 2, 3, 4, 5, 6 or ≥7) were available. For ewes the birth and rearing type corresponding to the litter born to the ewe for the year of measurement were also available.</w:t>
       </w:r>
     </w:p>
     <w:p>
@@ -2629,21 +2509,7 @@
         <w:rPr>
           <w:highlight w:val="yellow"/>
         </w:rPr>
-        <w:t xml:space="preserve">Carbon dioxide production (CO₂), measured concurrently on the same PAC record </w:t>
-      </w:r>
-      <w:proofErr w:type="gramStart"/>
-      <w:r>
-        <w:rPr>
-          <w:highlight w:val="yellow"/>
-        </w:rPr>
-        <w:t>and also</w:t>
-      </w:r>
-      <w:proofErr w:type="gramEnd"/>
-      <w:r>
-        <w:rPr>
-          <w:highlight w:val="yellow"/>
-        </w:rPr>
-        <w:t xml:space="preserve"> expressed in g day⁻¹, was also analysed.</w:t>
+        <w:t>Carbon dioxide production (CO₂), measured concurrently on the same PAC record and also expressed in g day⁻¹, was also analysed.</w:t>
       </w:r>
     </w:p>
     <w:p>
@@ -2699,15 +2565,7 @@
         <w:jc w:val="both"/>
       </w:pPr>
       <w:r>
-        <w:t xml:space="preserve">Variance components for all alternative methane traits were estimated using pedigree-based animal models fitted in </w:t>
-      </w:r>
-      <w:proofErr w:type="spellStart"/>
-      <w:r>
-        <w:t>ASReml</w:t>
-      </w:r>
-      <w:proofErr w:type="spellEnd"/>
-      <w:r>
-        <w:t xml:space="preserve"> version 4.2 </w:t>
+        <w:t xml:space="preserve">Variance components for all alternative methane traits were estimated using pedigree-based animal models fitted in ASReml version 4.2 </w:t>
       </w:r>
       <w:r>
         <w:fldChar w:fldCharType="begin"/>
@@ -2728,23 +2586,7 @@
         <w:fldChar w:fldCharType="end"/>
       </w:r>
       <w:r>
-        <w:t xml:space="preserve">. Pedigree records were available for 36,449 animals (all </w:t>
-      </w:r>
-      <w:proofErr w:type="spellStart"/>
-      <w:r>
-        <w:t>phenotyped</w:t>
-      </w:r>
-      <w:proofErr w:type="spellEnd"/>
-      <w:r>
-        <w:t xml:space="preserve"> animals plus their recursively traced ancestors) and were used to define the additive genetic relationships among animals; 100% of </w:t>
-      </w:r>
-      <w:proofErr w:type="spellStart"/>
-      <w:r>
-        <w:t>phenotyped</w:t>
-      </w:r>
-      <w:proofErr w:type="spellEnd"/>
-      <w:r>
-        <w:t xml:space="preserve"> animals were represented in the pedigree, 88.5% had both parents known, the pedigree comprised 1,025 unique sires with a mean pedigree depth of 17.6 generations, and 73.1% of sires linked in at least two contemporary groups. All methane traits were analysed using the following linear mixed animal model:</w:t>
+        <w:t>. Pedigree records were available for 36,449 animals (all phenotyped animals plus their recursively traced ancestors) and were used to define the additive genetic relationships among animals; 100% of phenotyped animals were represented in the pedigree, 88.5% had both parents known, the pedigree comprised 1,025 unique sires with a mean pedigree depth of 17.6 generations, and 73.1% of sires linked in at least two contemporary groups. All methane traits were analysed using the following linear mixed animal model:</w:t>
       </w:r>
     </w:p>
     <w:p>
@@ -2755,35 +2597,7 @@
         <w:rPr>
           <w:i/>
         </w:rPr>
-        <w:t xml:space="preserve">y = μ + sex + BR + CL + CV + LY + SU + TX + UN + het + rec + age + </w:t>
-      </w:r>
-      <w:proofErr w:type="spellStart"/>
-      <w:r>
-        <w:rPr>
-          <w:i/>
-        </w:rPr>
-        <w:t>BTg</w:t>
-      </w:r>
-      <w:proofErr w:type="spellEnd"/>
-      <w:r>
-        <w:rPr>
-          <w:i/>
-        </w:rPr>
-        <w:t xml:space="preserve"> + </w:t>
-      </w:r>
-      <w:proofErr w:type="spellStart"/>
-      <w:r>
-        <w:rPr>
-          <w:i/>
-        </w:rPr>
-        <w:t>RTg</w:t>
-      </w:r>
-      <w:proofErr w:type="spellEnd"/>
-      <w:r>
-        <w:rPr>
-          <w:i/>
-        </w:rPr>
-        <w:t xml:space="preserve"> + BTₑ + RTₑ + DP + CG + a + pe + e</w:t>
+        <w:t>y = μ + sex + BR + CL + CV + LY + SU + TX + UN + het + rec + age + BTg + RTg + BTₑ + RTₑ + DP + CG + a + pe + e</w:t>
       </w:r>
     </w:p>
     <w:p>
@@ -2819,15 +2633,7 @@
         <w:t>sex</w:t>
       </w:r>
       <w:r>
-        <w:t xml:space="preserve"> was the fixed class effect of sex (male or female); the fixed effects for breed proportion corresponding to </w:t>
-      </w:r>
-      <w:proofErr w:type="spellStart"/>
-      <w:r>
-        <w:t>Belclare</w:t>
-      </w:r>
-      <w:proofErr w:type="spellEnd"/>
-      <w:r>
-        <w:t xml:space="preserve"> (</w:t>
+        <w:t xml:space="preserve"> was the fixed class effect of sex (male or female); the fixed effects for breed proportion corresponding to Belclare (</w:t>
       </w:r>
       <w:r>
         <w:rPr>
@@ -2854,15 +2660,7 @@
         <w:t>CV</w:t>
       </w:r>
       <w:r>
-        <w:t xml:space="preserve">), </w:t>
-      </w:r>
-      <w:proofErr w:type="spellStart"/>
-      <w:r>
-        <w:t>Lleyn</w:t>
-      </w:r>
-      <w:proofErr w:type="spellEnd"/>
-      <w:r>
-        <w:t xml:space="preserve"> (</w:t>
+        <w:t>), Lleyn (</w:t>
       </w:r>
       <w:r>
         <w:rPr>
@@ -2940,47 +2738,39 @@
       <w:r>
         <w:t xml:space="preserve"> was the age at measurement (weeks of age); </w:t>
       </w:r>
-      <w:proofErr w:type="spellStart"/>
       <w:r>
         <w:rPr>
           <w:i/>
         </w:rPr>
         <w:t>BTg</w:t>
       </w:r>
-      <w:proofErr w:type="spellEnd"/>
       <w:r>
         <w:t xml:space="preserve"> was the fixed class effect of birth litter size of the growing animal itself (single, twin, triplet or quadruplet); </w:t>
       </w:r>
-      <w:proofErr w:type="spellStart"/>
       <w:r>
         <w:rPr>
           <w:i/>
         </w:rPr>
         <w:t>RTg</w:t>
       </w:r>
-      <w:proofErr w:type="spellEnd"/>
       <w:r>
         <w:t xml:space="preserve"> was the fixed class effect of rearing litter size of the growing animal itself (single, twin or triplet); </w:t>
       </w:r>
-      <w:proofErr w:type="spellStart"/>
       <w:r>
         <w:rPr>
           <w:i/>
         </w:rPr>
         <w:t>BTe</w:t>
       </w:r>
-      <w:proofErr w:type="spellEnd"/>
       <w:r>
         <w:t xml:space="preserve"> was the fixed class effect of birth litter size recorded for the ewe in the year of measurement (single, twin, triplet or quadruplet); </w:t>
       </w:r>
-      <w:proofErr w:type="spellStart"/>
       <w:r>
         <w:rPr>
           <w:i/>
         </w:rPr>
         <w:t>RTe</w:t>
       </w:r>
-      <w:proofErr w:type="spellEnd"/>
       <w:r>
         <w:t xml:space="preserve"> was the fixed class effect of rearing litter size recorded for the ewe in the year of measurement (single, twin or triplet); </w:t>
       </w:r>
@@ -3201,23 +2991,7 @@
         <w:jc w:val="both"/>
       </w:pPr>
       <w:r>
-        <w:t xml:space="preserve">Genetic parameters were taken from a </w:t>
-      </w:r>
-      <w:proofErr w:type="spellStart"/>
-      <w:r>
-        <w:t>trivariate</w:t>
-      </w:r>
-      <w:proofErr w:type="spellEnd"/>
-      <w:r>
-        <w:t xml:space="preserve"> animal model of CH₄, MBW and CO₂ fitted in </w:t>
-      </w:r>
-      <w:proofErr w:type="spellStart"/>
-      <w:r>
-        <w:t>ASReml</w:t>
-      </w:r>
-      <w:proofErr w:type="spellEnd"/>
-      <w:r>
-        <w:t xml:space="preserve"> </w:t>
+        <w:t xml:space="preserve">Genetic parameters were taken from a trivariate animal model of CH₄, MBW and CO₂ fitted in ASReml </w:t>
       </w:r>
       <w:r>
         <w:fldChar w:fldCharType="begin"/>
@@ -3327,7 +3101,6 @@
       <w:r>
         <w:t xml:space="preserve"> = </w:t>
       </w:r>
-      <w:proofErr w:type="spellStart"/>
       <w:r>
         <w:rPr>
           <w:i/>
@@ -3344,11 +3117,9 @@
         </w:rPr>
         <w:t>Gb</w:t>
       </w:r>
-      <w:proofErr w:type="spellEnd"/>
       <w:r>
         <w:t>/√(</w:t>
       </w:r>
-      <w:proofErr w:type="spellStart"/>
       <w:r>
         <w:rPr>
           <w:b/>
@@ -3366,36 +3137,17 @@
         </w:rPr>
         <w:t>Pb</w:t>
       </w:r>
-      <w:proofErr w:type="spellEnd"/>
       <w:r>
         <w:t xml:space="preserve">), where </w:t>
       </w:r>
-      <w:proofErr w:type="spellStart"/>
       <w:r>
         <w:rPr>
           <w:i/>
         </w:rPr>
         <w:t>i</w:t>
       </w:r>
-      <w:proofErr w:type="spellEnd"/>
-      <w:r>
-        <w:t xml:space="preserve"> is the selection intensity. Responses are reported per generation for a selection intensity (</w:t>
-      </w:r>
-      <w:proofErr w:type="spellStart"/>
-      <w:r>
-        <w:t>i</w:t>
-      </w:r>
-      <w:proofErr w:type="spellEnd"/>
-      <w:r>
-        <w:t xml:space="preserve">) of 1. Responses for </w:t>
-      </w:r>
-      <w:proofErr w:type="spellStart"/>
-      <w:r>
-        <w:t>i</w:t>
-      </w:r>
-      <w:proofErr w:type="spellEnd"/>
-      <w:r>
-        <w:t xml:space="preserve"> = 1.7 (approximately the top 10% of candidates selected) and annual responses (assuming a generation interval of 2.8 years) are given in Supplementary Table S2.</w:t>
+      <w:r>
+        <w:t xml:space="preserve"> is the selection intensity. Responses are reported per generation for a selection intensity (i) of 1. Responses for i = 1.7 (approximately the top 10% of candidates selected) and annual responses (assuming a generation interval of 2.8 years) are given in Supplementary Table S2.</w:t>
       </w:r>
     </w:p>
     <w:p>
@@ -3576,35 +3328,7 @@
         <w:rPr>
           <w:highlight w:val="yellow"/>
         </w:rPr>
-        <w:t xml:space="preserve">Uncertainty in the index results was quantified by Monte Carlo simulation. The 15 (co)variance parameters of the </w:t>
-      </w:r>
-      <w:proofErr w:type="spellStart"/>
-      <w:r>
-        <w:rPr>
-          <w:highlight w:val="yellow"/>
-        </w:rPr>
-        <w:t>trivariate</w:t>
-      </w:r>
-      <w:proofErr w:type="spellEnd"/>
-      <w:r>
-        <w:rPr>
-          <w:highlight w:val="yellow"/>
-        </w:rPr>
-        <w:t xml:space="preserve"> model were resampled jointly from a multivariate normal distribution, using their REML estimates and the sampling (co)variance matrix from </w:t>
-      </w:r>
-      <w:proofErr w:type="spellStart"/>
-      <w:r>
-        <w:rPr>
-          <w:highlight w:val="yellow"/>
-        </w:rPr>
-        <w:t>ASReml</w:t>
-      </w:r>
-      <w:proofErr w:type="spellEnd"/>
-      <w:r>
-        <w:rPr>
-          <w:highlight w:val="yellow"/>
-        </w:rPr>
-        <w:t xml:space="preserve">, so that both the standard errors of the estimates and the correlations among them were accounted for. For each of 10,000 samples, </w:t>
+        <w:t xml:space="preserve">Uncertainty in the index results was quantified by Monte Carlo simulation. The 15 (co)variance parameters of the trivariate model were resampled jointly from a multivariate normal distribution, using their REML estimates and the sampling (co)variance matrix from ASReml, so that both the standard errors of the estimates and the correlations among them were accounted for. For each of 10,000 samples, </w:t>
       </w:r>
       <w:r>
         <w:rPr>
@@ -3688,23 +3412,7 @@
         <w:t>Fixed-effect significance (Wald F-tests) and diagnostics of pedigree completeness and connectedness are presented in Supplementary Material S1.</w:t>
       </w:r>
       <w:r>
-        <w:t xml:space="preserve"> Texel and Suffolk proportions varied substantially within contemporary groups, whereas Cheviot and </w:t>
-      </w:r>
-      <w:proofErr w:type="spellStart"/>
-      <w:r>
-        <w:t>Lleyn</w:t>
-      </w:r>
-      <w:proofErr w:type="spellEnd"/>
-      <w:r>
-        <w:t xml:space="preserve"> proportions were largely confined to </w:t>
-      </w:r>
-      <w:proofErr w:type="gramStart"/>
-      <w:r>
-        <w:t>particular contemporary</w:t>
-      </w:r>
-      <w:proofErr w:type="gramEnd"/>
-      <w:r>
-        <w:t xml:space="preserve"> groups, so their breed effects cannot be cleanly separated from contemporary group effects. Most contemporary groups (82.1%) contained a single sex. The mean MBW was 22.10 (SD = 4.92) kg, mean live weight was 62.72 (SD = 18.18) kg, while mean ADG, muscle mass, and rumen volume were 0.18 (SD = 0.10) kg day⁻¹, 11.7 (SD = 3.24) kg, and 6.16 (SD = 1.49) L, respectively. Descriptive statistics for methane traits are presented in Table 1. Mean methane production was 17.9 (SD = 7.56) g day⁻¹, with methane intensity (CH₄/MBW) averaging 0.81 (SD = 0.29) g day⁻¹ kg⁻⁰·⁷⁵. </w:t>
+        <w:t xml:space="preserve"> Texel and Suffolk proportions varied substantially within contemporary groups, whereas Cheviot and Lleyn proportions were largely confined to particular contemporary groups, so their breed effects cannot be cleanly separated from contemporary group effects. Most contemporary groups (82.1%) contained a single sex. The mean MBW was 22.10 (SD = 4.92) kg, mean live weight was 62.72 (SD = 18.18) kg, while mean ADG, muscle mass, and rumen volume were 0.18 (SD = 0.10) kg day⁻¹, 11.7 (SD = 3.24) kg, and 6.16 (SD = 1.49) L, respectively. Descriptive statistics for methane traits are presented in Table 1. Mean methane production was 17.9 (SD = 7.56) g day⁻¹, with methane intensity (CH₄/MBW) averaging 0.81 (SD = 0.29) g day⁻¹ kg⁻⁰·⁷⁵. </w:t>
       </w:r>
       <w:r>
         <w:rPr>
@@ -4925,39 +4633,7 @@
         <w:jc w:val="both"/>
       </w:pPr>
       <w:r>
-        <w:t>Genetic parameters for the methane and CO₂ trait definitions are presented in Table 2. Genetic standard deviations ranged from 0.06 g day⁻¹ kg⁻⁰·⁷⁵ for methane intensity (CH₄/MBW) to 35.92 g kg⁻¹ for methane expressed relative to growth rate (CH₄/ADG), with corresponding genetic coefficient of variation (</w:t>
-      </w:r>
-      <w:proofErr w:type="spellStart"/>
-      <w:r>
-        <w:t>CVa</w:t>
-      </w:r>
-      <w:proofErr w:type="spellEnd"/>
-      <w:r>
-        <w:t xml:space="preserve">) values of 7.44% and 26.05%, respectively. Methane production (CH₄) had a genetic standard deviation of 1.47 g day⁻¹ and </w:t>
-      </w:r>
-      <w:proofErr w:type="spellStart"/>
-      <w:r>
-        <w:t>CVa</w:t>
-      </w:r>
-      <w:proofErr w:type="spellEnd"/>
-      <w:r>
-        <w:t xml:space="preserve"> of 8.20%, and carbon dioxide production (CO₂) had a genetic standard deviation of 117.18 g day⁻¹ and </w:t>
-      </w:r>
-      <w:proofErr w:type="spellStart"/>
-      <w:r>
-        <w:t>CVa</w:t>
-      </w:r>
-      <w:proofErr w:type="spellEnd"/>
-      <w:r>
-        <w:t xml:space="preserve"> of 9.85%. The genetic standard deviation for methane expressed relative to muscle mass and rumen volume were 0.20 g day⁻¹ kg⁻¹ and 0.37 g day⁻¹ L⁻¹ with </w:t>
-      </w:r>
-      <w:proofErr w:type="spellStart"/>
-      <w:r>
-        <w:t>CVa</w:t>
-      </w:r>
-      <w:proofErr w:type="spellEnd"/>
-      <w:r>
-        <w:t xml:space="preserve"> values of 13.59% and 13.83%, respectively. Residual methane traits (RMTMBW, RMTMBW+CO₂, and RMTADG) had genetic standard deviations of 1.29, 1.41, and 1.55 g day⁻¹.</w:t>
+        <w:t>Genetic parameters for the methane and CO₂ trait definitions are presented in Table 2. Genetic standard deviations ranged from 0.06 g day⁻¹ kg⁻⁰·⁷⁵ for methane intensity (CH₄/MBW) to 35.92 g kg⁻¹ for methane expressed relative to growth rate (CH₄/ADG), with corresponding genetic coefficient of variation (CVa) values of 7.44% and 26.05%, respectively. Methane production (CH₄) had a genetic standard deviation of 1.47 g day⁻¹ and CVa of 8.20%, and carbon dioxide production (CO₂) had a genetic standard deviation of 117.18 g day⁻¹ and CVa of 9.85%. The genetic standard deviation for methane expressed relative to muscle mass and rumen volume were 0.20 g day⁻¹ kg⁻¹ and 0.37 g day⁻¹ L⁻¹ with CVa values of 13.59% and 13.83%, respectively. Residual methane traits (RMTMBW, RMTMBW+CO₂, and RMTADG) had genetic standard deviations of 1.29, 1.41, and 1.55 g day⁻¹.</w:t>
       </w:r>
     </w:p>
     <w:p>
@@ -5055,7 +4731,6 @@
               <w:jc w:val="center"/>
               <w:cnfStyle w:val="100000000000" w:firstRow="1" w:lastRow="0" w:firstColumn="0" w:lastColumn="0" w:oddVBand="0" w:evenVBand="0" w:oddHBand="0" w:evenHBand="0" w:firstRowFirstColumn="0" w:firstRowLastColumn="0" w:lastRowFirstColumn="0" w:lastRowLastColumn="0"/>
             </w:pPr>
-            <w:proofErr w:type="spellStart"/>
             <w:r>
               <w:rPr>
                 <w:b w:val="0"/>
@@ -5063,7 +4738,6 @@
               </w:rPr>
               <w:t>σa</w:t>
             </w:r>
-            <w:proofErr w:type="spellEnd"/>
           </w:p>
         </w:tc>
         <w:tc>
@@ -5075,7 +4749,6 @@
               <w:jc w:val="center"/>
               <w:cnfStyle w:val="100000000000" w:firstRow="1" w:lastRow="0" w:firstColumn="0" w:lastColumn="0" w:oddVBand="0" w:evenVBand="0" w:oddHBand="0" w:evenHBand="0" w:firstRowFirstColumn="0" w:firstRowLastColumn="0" w:lastRowFirstColumn="0" w:lastRowLastColumn="0"/>
             </w:pPr>
-            <w:proofErr w:type="spellStart"/>
             <w:r>
               <w:rPr>
                 <w:b w:val="0"/>
@@ -5083,7 +4756,6 @@
               </w:rPr>
               <w:t>σpe</w:t>
             </w:r>
-            <w:proofErr w:type="spellEnd"/>
           </w:p>
         </w:tc>
         <w:tc>
@@ -5131,7 +4803,6 @@
               <w:jc w:val="center"/>
               <w:cnfStyle w:val="100000000000" w:firstRow="1" w:lastRow="0" w:firstColumn="0" w:lastColumn="0" w:oddVBand="0" w:evenVBand="0" w:oddHBand="0" w:evenHBand="0" w:firstRowFirstColumn="0" w:firstRowLastColumn="0" w:lastRowFirstColumn="0" w:lastRowLastColumn="0"/>
             </w:pPr>
-            <w:proofErr w:type="spellStart"/>
             <w:r>
               <w:rPr>
                 <w:b w:val="0"/>
@@ -5139,7 +4810,6 @@
               </w:rPr>
               <w:t>CVa</w:t>
             </w:r>
-            <w:proofErr w:type="spellEnd"/>
           </w:p>
         </w:tc>
       </w:tr>
@@ -6374,15 +6044,7 @@
         <w:jc w:val="both"/>
       </w:pPr>
       <w:r>
-        <w:t xml:space="preserve">Genetic and phenotypic correlations between daily methane production (CH₄), CO₂, and each alternative methane trait definition are presented in Table 3. Phenotypically, daily methane was strongly correlated with the size-adjusted definitions (0.87 with both CH₄/MBW and CH₄/MM, 0.90 with RMTMBW, 0.79 with RMTMBW+CO₂ and 0.71 with CH₄/rumen) and essentially perfectly correlated with RMTADG (1.00), but </w:t>
-      </w:r>
-      <w:proofErr w:type="gramStart"/>
-      <w:r>
-        <w:t>more weakly</w:t>
-      </w:r>
-      <w:proofErr w:type="gramEnd"/>
-      <w:r>
-        <w:t xml:space="preserve"> with CH₄/ADG (0.31) and CH₄ ratio (0.46).</w:t>
+        <w:t>Genetic and phenotypic correlations between daily methane production (CH₄), CO₂, and each alternative methane trait definition are presented in Table 3. Phenotypically, daily methane was strongly correlated with the size-adjusted definitions (0.87 with both CH₄/MBW and CH₄/MM, 0.90 with RMTMBW, 0.79 with RMTMBW+CO₂ and 0.71 with CH₄/rumen) and essentially perfectly correlated with RMTADG (1.00), but more weakly with CH₄/ADG (0.31) and CH₄ ratio (0.46).</w:t>
       </w:r>
     </w:p>
     <w:p>
@@ -9456,15 +9118,7 @@
         <w:jc w:val="both"/>
       </w:pPr>
       <w:r>
-        <w:t xml:space="preserve">Genetic parameters from the </w:t>
-      </w:r>
-      <w:proofErr w:type="spellStart"/>
-      <w:r>
-        <w:t>trivariate</w:t>
-      </w:r>
-      <w:proofErr w:type="spellEnd"/>
-      <w:r>
-        <w:t xml:space="preserve"> analysis of CH₄, MBW and CO₂, used for all index calculations, are given in Supplementary Table S3.</w:t>
+        <w:t>Genetic parameters from the trivariate analysis of CH₄, MBW and CO₂, used for all index calculations, are given in Supplementary Table S3.</w:t>
       </w:r>
     </w:p>
     <w:p>
@@ -10042,39 +9696,7 @@
           <w:i/>
           <w:sz w:val="20"/>
         </w:rPr>
-        <w:t xml:space="preserve">Weights are per −1 on the methane term, i.e. the goal is </w:t>
-      </w:r>
-      <w:proofErr w:type="gramStart"/>
-      <w:r>
-        <w:rPr>
-          <w:i/>
-          <w:sz w:val="20"/>
-        </w:rPr>
-        <w:t>−(</w:t>
-      </w:r>
-      <w:proofErr w:type="gramEnd"/>
-      <w:r>
-        <w:rPr>
-          <w:i/>
-          <w:sz w:val="20"/>
-        </w:rPr>
-        <w:t>methane term) + w(MBW)·MBW + w(CO</w:t>
-      </w:r>
-      <w:proofErr w:type="gramStart"/>
-      <w:r>
-        <w:rPr>
-          <w:i/>
-          <w:sz w:val="20"/>
-        </w:rPr>
-        <w:t>₂)·</w:t>
-      </w:r>
-      <w:proofErr w:type="gramEnd"/>
-      <w:r>
-        <w:rPr>
-          <w:i/>
-          <w:sz w:val="20"/>
-        </w:rPr>
-        <w:t>CO₂. They are relative breeding-goal weights (a), not economic values: only their ratios matter, and all five goals give the same index and the same responses. They differ only because each methane term already carries some weight on MBW and CO₂ (ratios linearised around the trait means; residual regression coefficients as in Methods). The corresponding selection index weights (b) are given in Supplementary Table S4. Abbreviations: CH₄ = daily methane output (g day⁻¹); MBW = metabolic body weight (kg⁰·⁷⁵); CO₂ = daily carbon dioxide output (g day⁻¹); CH₄ ratio = CH₄/(CH₄+CO₂), mass basis; RMTMBW+CO₂ = residual methane from regression of CH₄ on MBW and CO₂. Responses are per generation at selection intensity 1.</w:t>
+        <w:t>Weights are per −1 on the methane term, i.e. the goal is −(methane term) + w(MBW)·MBW + w(CO₂)·CO₂. They are relative breeding-goal weights (a), not economic values: only their ratios matter, and all five goals give the same index and the same responses. They differ only because each methane term already carries some weight on MBW and CO₂ (ratios linearised around the trait means; residual regression coefficients as in Methods). The corresponding selection index weights (b) are given in Supplementary Table S4. Abbreviations: CH₄ = daily methane output (g day⁻¹); MBW = metabolic body weight (kg⁰·⁷⁵); CO₂ = daily carbon dioxide output (g day⁻¹); CH₄ ratio = CH₄/(CH₄+CO₂), mass basis; RMTMBW+CO₂ = residual methane from regression of CH₄ on MBW and CO₂. Responses are per generation at selection intensity 1.</w:t>
       </w:r>
     </w:p>
     <w:p>
@@ -10351,12 +9973,13 @@
 YyBNZXRoYW5lIEVtaXNzaW9ucyBpbiBJbmRvb3ItRmVkIEdyb3dpbmcgQ2F0dGxlPC90aXRsZT48
 c2Vjb25kYXJ5LXRpdGxlPkpvdXJuYWwgb2YgQW5pbWFsIFNjaWVuY2U8L3NlY29uZGFyeS10aXRs
 ZT48L3RpdGxlcz48cGVyaW9kaWNhbD48ZnVsbC10aXRsZT5Kb3VybmFsIG9mIEFuaW1hbCBTY2ll
-bmNlPC9mdWxsLXRpdGxlPjwvcGVyaW9kaWNhbD48ZGF0ZXM+PHllYXI+MjAyNjwveWVhcj48L2Rh
-dGVzPjxpc2JuPjE1MjUtMzE2MzwvaXNibj48dXJscz48cmVsYXRlZC11cmxzPjx1cmw+aHR0cHM6
-Ly9kb2kub3JnLzEwLjEwOTMvamFzL3NrYWcwNDY8L3VybD48L3JlbGF0ZWQtdXJscz48L3VybHM+
-PGN1c3RvbTE+c2thZzA0NjwvY3VzdG9tMT48ZWxlY3Ryb25pYy1yZXNvdXJjZS1udW0+MTAuMTA5
-My9qYXMvc2thZzA0NjwvZWxlY3Ryb25pYy1yZXNvdXJjZS1udW0+PGFjY2Vzcy1kYXRlPjIvMjUv
-MjAyNjwvYWNjZXNzLWRhdGU+PC9yZWNvcmQ+PC9DaXRlPjwvRW5kTm90ZT5=
+bmNlPC9mdWxsLXRpdGxlPjwvcGVyaW9kaWNhbD48cGFnZXM+c2thZzA0NjwvcGFnZXM+PHZvbHVt
+ZT4xMDQ8L3ZvbHVtZT48ZGF0ZXM+PHllYXI+MjAyNjwveWVhcj48L2RhdGVzPjxpc2JuPjE1MjUt
+MzE2MzwvaXNibj48dXJscz48cmVsYXRlZC11cmxzPjx1cmw+aHR0cHM6Ly9kb2kub3JnLzEwLjEw
+OTMvamFzL3NrYWcwNDY8L3VybD48L3JlbGF0ZWQtdXJscz48L3VybHM+PGN1c3RvbTE+c2thZzA0
+NjwvY3VzdG9tMT48ZWxlY3Ryb25pYy1yZXNvdXJjZS1udW0+MTAuMTA5My9qYXMvc2thZzA0Njwv
+ZWxlY3Ryb25pYy1yZXNvdXJjZS1udW0+PGFjY2Vzcy1kYXRlPjIvMjUvMjAyNjwvYWNjZXNzLWRh
+dGU+PC9yZWNvcmQ+PC9DaXRlPjwvRW5kTm90ZT5=
 </w:fldData>
         </w:fldChar>
       </w:r>
@@ -10410,12 +10033,13 @@
 YyBNZXRoYW5lIEVtaXNzaW9ucyBpbiBJbmRvb3ItRmVkIEdyb3dpbmcgQ2F0dGxlPC90aXRsZT48
 c2Vjb25kYXJ5LXRpdGxlPkpvdXJuYWwgb2YgQW5pbWFsIFNjaWVuY2U8L3NlY29uZGFyeS10aXRs
 ZT48L3RpdGxlcz48cGVyaW9kaWNhbD48ZnVsbC10aXRsZT5Kb3VybmFsIG9mIEFuaW1hbCBTY2ll
-bmNlPC9mdWxsLXRpdGxlPjwvcGVyaW9kaWNhbD48ZGF0ZXM+PHllYXI+MjAyNjwveWVhcj48L2Rh
-dGVzPjxpc2JuPjE1MjUtMzE2MzwvaXNibj48dXJscz48cmVsYXRlZC11cmxzPjx1cmw+aHR0cHM6
-Ly9kb2kub3JnLzEwLjEwOTMvamFzL3NrYWcwNDY8L3VybD48L3JlbGF0ZWQtdXJscz48L3VybHM+
-PGN1c3RvbTE+c2thZzA0NjwvY3VzdG9tMT48ZWxlY3Ryb25pYy1yZXNvdXJjZS1udW0+MTAuMTA5
-My9qYXMvc2thZzA0NjwvZWxlY3Ryb25pYy1yZXNvdXJjZS1udW0+PGFjY2Vzcy1kYXRlPjIvMjUv
-MjAyNjwvYWNjZXNzLWRhdGU+PC9yZWNvcmQ+PC9DaXRlPjwvRW5kTm90ZT5=
+bmNlPC9mdWxsLXRpdGxlPjwvcGVyaW9kaWNhbD48cGFnZXM+c2thZzA0NjwvcGFnZXM+PHZvbHVt
+ZT4xMDQ8L3ZvbHVtZT48ZGF0ZXM+PHllYXI+MjAyNjwveWVhcj48L2RhdGVzPjxpc2JuPjE1MjUt
+MzE2MzwvaXNibj48dXJscz48cmVsYXRlZC11cmxzPjx1cmw+aHR0cHM6Ly9kb2kub3JnLzEwLjEw
+OTMvamFzL3NrYWcwNDY8L3VybD48L3JlbGF0ZWQtdXJscz48L3VybHM+PGN1c3RvbTE+c2thZzA0
+NjwvY3VzdG9tMT48ZWxlY3Ryb25pYy1yZXNvdXJjZS1udW0+MTAuMTA5My9qYXMvc2thZzA0Njwv
+ZWxlY3Ryb25pYy1yZXNvdXJjZS1udW0+PGFjY2Vzcy1kYXRlPjIvMjUvMjAyNjwvYWNjZXNzLWRh
+dGU+PC9yZWNvcmQ+PC9DaXRlPjwvRW5kTm90ZT5=
 </w:fldData>
         </w:fldChar>
       </w:r>
@@ -10840,15 +10464,7 @@
         <w:fldChar w:fldCharType="end"/>
       </w:r>
       <w:r>
-        <w:t xml:space="preserve">. Where intake is recorded, methane is therefore commonly expressed per unit of intake (methane yield) or </w:t>
-      </w:r>
-      <w:proofErr w:type="spellStart"/>
-      <w:r>
-        <w:t>residualised</w:t>
-      </w:r>
-      <w:proofErr w:type="spellEnd"/>
-      <w:r>
-        <w:t xml:space="preserve"> on intake </w:t>
+        <w:t xml:space="preserve">. Where intake is recorded, methane is therefore commonly expressed per unit of intake (methane yield) or residualised on intake </w:t>
       </w:r>
       <w:r>
         <w:fldChar w:fldCharType="begin">
@@ -10994,15 +10610,7 @@
         <w:fldChar w:fldCharType="end"/>
       </w:r>
       <w:r>
-        <w:t xml:space="preserve">. In grazing sheep, however, feed intake is rarely measured at scale, and scaling or </w:t>
-      </w:r>
-      <w:proofErr w:type="spellStart"/>
-      <w:r>
-        <w:t>residualising</w:t>
-      </w:r>
-      <w:proofErr w:type="spellEnd"/>
-      <w:r>
-        <w:t xml:space="preserve"> methane against body size, growth or production traits serves as a practical proxy for that missing feed-intake information </w:t>
+        <w:t xml:space="preserve">. In grazing sheep, however, feed intake is rarely measured at scale, and scaling or residualising methane against body size, growth or production traits serves as a practical proxy for that missing feed-intake information </w:t>
       </w:r>
       <w:r>
         <w:fldChar w:fldCharType="begin">
@@ -11040,33 +10648,34 @@
 Y2UgdHJhaXRzIGluIGluZG9vci1mZWQgZ3Jvd2luZyBjYXR0bGU8L3RpdGxlPjxzZWNvbmRhcnkt
 dGl0bGU+Sm91cm5hbCBvZiBBbmltYWwgU2NpZW5jZTwvc2Vjb25kYXJ5LXRpdGxlPjwvdGl0bGVz
 PjxwZXJpb2RpY2FsPjxmdWxsLXRpdGxlPkpvdXJuYWwgb2YgQW5pbWFsIFNjaWVuY2U8L2Z1bGwt
-dGl0bGU+PC9wZXJpb2RpY2FsPjx2b2x1bWU+MTAyPC92b2x1bWU+PGRhdGVzPjx5ZWFyPjIwMjQ8
-L3llYXI+PC9kYXRlcz48aXNibj4xNTI1LTMxNjM8L2lzYm4+PHVybHM+PHJlbGF0ZWQtdXJscz48
-dXJsPmh0dHBzOi8vZG9pLm9yZy8xMC4xMDkzL2phcy9za2FlMzQ2PC91cmw+PC9yZWxhdGVkLXVy
-bHM+PC91cmxzPjxjdXN0b20xPnNrYWUzNDY8L2N1c3RvbTE+PGVsZWN0cm9uaWMtcmVzb3VyY2Ut
-bnVtPjEwLjEwOTMvamFzL3NrYWUzNDY8L2VsZWN0cm9uaWMtcmVzb3VyY2UtbnVtPjxhY2Nlc3Mt
-ZGF0ZT4yLzI3LzIwMjU8L2FjY2Vzcy1kYXRlPjwvcmVjb3JkPjwvQ2l0ZT48Q2l0ZT48QXV0aG9y
-PlNtaXRoPC9BdXRob3I+PFllYXI+MjAyMTwvWWVhcj48UmVjTnVtPjc5PC9SZWNOdW0+PHJlY29y
-ZD48cmVjLW51bWJlcj43OTwvcmVjLW51bWJlcj48Zm9yZWlnbi1rZXlzPjxrZXkgYXBwPSJFTiIg
-ZGItaWQ9IndheHd6cHJwZHM1ZjlkZXM1emR4YTU1anpzcHB4NTVmcHcyMCIgdGltZXN0YW1wPSIx
-NzQxNzgyNjA5Ij43OTwva2V5PjwvZm9yZWlnbi1rZXlzPjxyZWYtdHlwZSBuYW1lPSJKb3VybmFs
-IEFydGljbGUiPjE3PC9yZWYtdHlwZT48Y29udHJpYnV0b3JzPjxhdXRob3JzPjxhdXRob3I+U21p
-dGgsIFBhdWwgRTwvYXV0aG9yPjxhdXRob3I+V2F0ZXJzLCBTaW5lYWQgTTwvYXV0aG9yPjxhdXRo
-b3I+S2VubnksIERhdmlkIEE8L2F1dGhvcj48YXV0aG9yPktpcndhbiwgU3R1YXJ0IEY8L2F1dGhv
-cj48YXV0aG9yPkNvbnJveSwgU3RlcGhlbjwvYXV0aG9yPjxhdXRob3I+S2VsbHksIEFsYW4gSzwv
-YXV0aG9yPjwvYXV0aG9ycz48L2NvbnRyaWJ1dG9ycz48dGl0bGVzPjx0aXRsZT5FZmZlY3Qgb2Yg
-ZGl2ZXJnZW5jZSBpbiByZXNpZHVhbCBtZXRoYW5lIGVtaXNzaW9ucyBvbiBmZWVkIGludGFrZSBh
-bmQgZWZmaWNpZW5jeSwgZ3Jvd3RoIGFuZCBjYXJjYXNzIHBlcmZvcm1hbmNlLCBhbmQgaW5kaWNl
-cyBvZiBydW1lbiBmZXJtZW50YXRpb24gYW5kIG1ldGhhbmUgZW1pc3Npb25zIGluIGZpbmlzaGlu
-ZyBiZWVmIGNhdHRsZTwvdGl0bGU+PHNlY29uZGFyeS10aXRsZT5Kb3VybmFsIG9mIEFuaW1hbCBT
-Y2llbmNlPC9zZWNvbmRhcnktdGl0bGU+PC90aXRsZXM+PHBlcmlvZGljYWw+PGZ1bGwtdGl0bGU+
-Sm91cm5hbCBvZiBBbmltYWwgU2NpZW5jZTwvZnVsbC10aXRsZT48L3BlcmlvZGljYWw+PHZvbHVt
-ZT45OTwvdm9sdW1lPjxudW1iZXI+MTE8L251bWJlcj48ZGF0ZXM+PHllYXI+MjAyMTwveWVhcj48
-L2RhdGVzPjxpc2JuPjE1MjUtMzE2MzwvaXNibj48dXJscz48cmVsYXRlZC11cmxzPjx1cmw+aHR0
-cHM6Ly9kb2kub3JnLzEwLjEwOTMvamFzL3NrYWIyNzU8L3VybD48L3JlbGF0ZWQtdXJscz48L3Vy
-bHM+PGN1c3RvbTE+c2thYjI3NTwvY3VzdG9tMT48ZWxlY3Ryb25pYy1yZXNvdXJjZS1udW0+MTAu
-MTA5My9qYXMvc2thYjI3NTwvZWxlY3Ryb25pYy1yZXNvdXJjZS1udW0+PGFjY2Vzcy1kYXRlPjMv
-MTIvMjAyNTwvYWNjZXNzLWRhdGU+PC9yZWNvcmQ+PC9DaXRlPjwvRW5kTm90ZT4A
+dGl0bGU+PC9wZXJpb2RpY2FsPjxwYWdlcz5za2FlMzQ2PC9wYWdlcz48dm9sdW1lPjEwMjwvdm9s
+dW1lPjxkYXRlcz48eWVhcj4yMDI0PC95ZWFyPjwvZGF0ZXM+PGlzYm4+MTUyNS0zMTYzPC9pc2Ju
+Pjx1cmxzPjxyZWxhdGVkLXVybHM+PHVybD5odHRwczovL2RvaS5vcmcvMTAuMTA5My9qYXMvc2th
+ZTM0NjwvdXJsPjwvcmVsYXRlZC11cmxzPjwvdXJscz48Y3VzdG9tMT5za2FlMzQ2PC9jdXN0b20x
+PjxlbGVjdHJvbmljLXJlc291cmNlLW51bT4xMC4xMDkzL2phcy9za2FlMzQ2PC9lbGVjdHJvbmlj
+LXJlc291cmNlLW51bT48YWNjZXNzLWRhdGU+Mi8yNy8yMDI1PC9hY2Nlc3MtZGF0ZT48L3JlY29y
+ZD48L0NpdGU+PENpdGU+PEF1dGhvcj5TbWl0aDwvQXV0aG9yPjxZZWFyPjIwMjE8L1llYXI+PFJl
+Y051bT43OTwvUmVjTnVtPjxyZWNvcmQ+PHJlYy1udW1iZXI+Nzk8L3JlYy1udW1iZXI+PGZvcmVp
+Z24ta2V5cz48a2V5IGFwcD0iRU4iIGRiLWlkPSJ3YXh3enBycGRzNWY5ZGVzNXpkeGE1NWp6c3Bw
+eDU1ZnB3MjAiIHRpbWVzdGFtcD0iMTc0MTc4MjYwOSI+Nzk8L2tleT48L2ZvcmVpZ24ta2V5cz48
+cmVmLXR5cGUgbmFtZT0iSm91cm5hbCBBcnRpY2xlIj4xNzwvcmVmLXR5cGU+PGNvbnRyaWJ1dG9y
+cz48YXV0aG9ycz48YXV0aG9yPlNtaXRoLCBQYXVsIEU8L2F1dGhvcj48YXV0aG9yPldhdGVycywg
+U2luZWFkIE08L2F1dGhvcj48YXV0aG9yPktlbm55LCBEYXZpZCBBPC9hdXRob3I+PGF1dGhvcj5L
+aXJ3YW4sIFN0dWFydCBGPC9hdXRob3I+PGF1dGhvcj5Db25yb3ksIFN0ZXBoZW48L2F1dGhvcj48
+YXV0aG9yPktlbGx5LCBBbGFuIEs8L2F1dGhvcj48L2F1dGhvcnM+PC9jb250cmlidXRvcnM+PHRp
+dGxlcz48dGl0bGU+RWZmZWN0IG9mIGRpdmVyZ2VuY2UgaW4gcmVzaWR1YWwgbWV0aGFuZSBlbWlz
+c2lvbnMgb24gZmVlZCBpbnRha2UgYW5kIGVmZmljaWVuY3ksIGdyb3d0aCBhbmQgY2FyY2FzcyBw
+ZXJmb3JtYW5jZSwgYW5kIGluZGljZXMgb2YgcnVtZW4gZmVybWVudGF0aW9uIGFuZCBtZXRoYW5l
+IGVtaXNzaW9ucyBpbiBmaW5pc2hpbmcgYmVlZiBjYXR0bGU8L3RpdGxlPjxzZWNvbmRhcnktdGl0
+bGU+Sm91cm5hbCBvZiBBbmltYWwgU2NpZW5jZTwvc2Vjb25kYXJ5LXRpdGxlPjwvdGl0bGVzPjxw
+ZXJpb2RpY2FsPjxmdWxsLXRpdGxlPkpvdXJuYWwgb2YgQW5pbWFsIFNjaWVuY2U8L2Z1bGwtdGl0
+bGU+PC9wZXJpb2RpY2FsPjx2b2x1bWU+OTk8L3ZvbHVtZT48bnVtYmVyPjExPC9udW1iZXI+PGRh
+dGVzPjx5ZWFyPjIwMjE8L3llYXI+PC9kYXRlcz48aXNibj4xNTI1LTMxNjM8L2lzYm4+PHVybHM+
+PHJlbGF0ZWQtdXJscz48dXJsPmh0dHBzOi8vZG9pLm9yZy8xMC4xMDkzL2phcy9za2FiMjc1PC91
+cmw+PC9yZWxhdGVkLXVybHM+PC91cmxzPjxjdXN0b20xPnNrYWIyNzU8L2N1c3RvbTE+PGVsZWN0
+cm9uaWMtcmVzb3VyY2UtbnVtPjEwLjEwOTMvamFzL3NrYWIyNzU8L2VsZWN0cm9uaWMtcmVzb3Vy
+Y2UtbnVtPjxhY2Nlc3MtZGF0ZT4zLzEyLzIwMjU8L2FjY2Vzcy1kYXRlPjwvcmVjb3JkPjwvQ2l0
+ZT48L0VuZE5vdGU+AG==
 </w:fldData>
         </w:fldChar>
       </w:r>
@@ -11109,33 +10718,34 @@
 Y2UgdHJhaXRzIGluIGluZG9vci1mZWQgZ3Jvd2luZyBjYXR0bGU8L3RpdGxlPjxzZWNvbmRhcnkt
 dGl0bGU+Sm91cm5hbCBvZiBBbmltYWwgU2NpZW5jZTwvc2Vjb25kYXJ5LXRpdGxlPjwvdGl0bGVz
 PjxwZXJpb2RpY2FsPjxmdWxsLXRpdGxlPkpvdXJuYWwgb2YgQW5pbWFsIFNjaWVuY2U8L2Z1bGwt
-dGl0bGU+PC9wZXJpb2RpY2FsPjx2b2x1bWU+MTAyPC92b2x1bWU+PGRhdGVzPjx5ZWFyPjIwMjQ8
-L3llYXI+PC9kYXRlcz48aXNibj4xNTI1LTMxNjM8L2lzYm4+PHVybHM+PHJlbGF0ZWQtdXJscz48
-dXJsPmh0dHBzOi8vZG9pLm9yZy8xMC4xMDkzL2phcy9za2FlMzQ2PC91cmw+PC9yZWxhdGVkLXVy
-bHM+PC91cmxzPjxjdXN0b20xPnNrYWUzNDY8L2N1c3RvbTE+PGVsZWN0cm9uaWMtcmVzb3VyY2Ut
-bnVtPjEwLjEwOTMvamFzL3NrYWUzNDY8L2VsZWN0cm9uaWMtcmVzb3VyY2UtbnVtPjxhY2Nlc3Mt
-ZGF0ZT4yLzI3LzIwMjU8L2FjY2Vzcy1kYXRlPjwvcmVjb3JkPjwvQ2l0ZT48Q2l0ZT48QXV0aG9y
-PlNtaXRoPC9BdXRob3I+PFllYXI+MjAyMTwvWWVhcj48UmVjTnVtPjc5PC9SZWNOdW0+PHJlY29y
-ZD48cmVjLW51bWJlcj43OTwvcmVjLW51bWJlcj48Zm9yZWlnbi1rZXlzPjxrZXkgYXBwPSJFTiIg
-ZGItaWQ9IndheHd6cHJwZHM1ZjlkZXM1emR4YTU1anpzcHB4NTVmcHcyMCIgdGltZXN0YW1wPSIx
-NzQxNzgyNjA5Ij43OTwva2V5PjwvZm9yZWlnbi1rZXlzPjxyZWYtdHlwZSBuYW1lPSJKb3VybmFs
-IEFydGljbGUiPjE3PC9yZWYtdHlwZT48Y29udHJpYnV0b3JzPjxhdXRob3JzPjxhdXRob3I+U21p
-dGgsIFBhdWwgRTwvYXV0aG9yPjxhdXRob3I+V2F0ZXJzLCBTaW5lYWQgTTwvYXV0aG9yPjxhdXRo
-b3I+S2VubnksIERhdmlkIEE8L2F1dGhvcj48YXV0aG9yPktpcndhbiwgU3R1YXJ0IEY8L2F1dGhv
-cj48YXV0aG9yPkNvbnJveSwgU3RlcGhlbjwvYXV0aG9yPjxhdXRob3I+S2VsbHksIEFsYW4gSzwv
-YXV0aG9yPjwvYXV0aG9ycz48L2NvbnRyaWJ1dG9ycz48dGl0bGVzPjx0aXRsZT5FZmZlY3Qgb2Yg
-ZGl2ZXJnZW5jZSBpbiByZXNpZHVhbCBtZXRoYW5lIGVtaXNzaW9ucyBvbiBmZWVkIGludGFrZSBh
-bmQgZWZmaWNpZW5jeSwgZ3Jvd3RoIGFuZCBjYXJjYXNzIHBlcmZvcm1hbmNlLCBhbmQgaW5kaWNl
-cyBvZiBydW1lbiBmZXJtZW50YXRpb24gYW5kIG1ldGhhbmUgZW1pc3Npb25zIGluIGZpbmlzaGlu
-ZyBiZWVmIGNhdHRsZTwvdGl0bGU+PHNlY29uZGFyeS10aXRsZT5Kb3VybmFsIG9mIEFuaW1hbCBT
-Y2llbmNlPC9zZWNvbmRhcnktdGl0bGU+PC90aXRsZXM+PHBlcmlvZGljYWw+PGZ1bGwtdGl0bGU+
-Sm91cm5hbCBvZiBBbmltYWwgU2NpZW5jZTwvZnVsbC10aXRsZT48L3BlcmlvZGljYWw+PHZvbHVt
-ZT45OTwvdm9sdW1lPjxudW1iZXI+MTE8L251bWJlcj48ZGF0ZXM+PHllYXI+MjAyMTwveWVhcj48
-L2RhdGVzPjxpc2JuPjE1MjUtMzE2MzwvaXNibj48dXJscz48cmVsYXRlZC11cmxzPjx1cmw+aHR0
-cHM6Ly9kb2kub3JnLzEwLjEwOTMvamFzL3NrYWIyNzU8L3VybD48L3JlbGF0ZWQtdXJscz48L3Vy
-bHM+PGN1c3RvbTE+c2thYjI3NTwvY3VzdG9tMT48ZWxlY3Ryb25pYy1yZXNvdXJjZS1udW0+MTAu
-MTA5My9qYXMvc2thYjI3NTwvZWxlY3Ryb25pYy1yZXNvdXJjZS1udW0+PGFjY2Vzcy1kYXRlPjMv
-MTIvMjAyNTwvYWNjZXNzLWRhdGU+PC9yZWNvcmQ+PC9DaXRlPjwvRW5kTm90ZT4A
+dGl0bGU+PC9wZXJpb2RpY2FsPjxwYWdlcz5za2FlMzQ2PC9wYWdlcz48dm9sdW1lPjEwMjwvdm9s
+dW1lPjxkYXRlcz48eWVhcj4yMDI0PC95ZWFyPjwvZGF0ZXM+PGlzYm4+MTUyNS0zMTYzPC9pc2Ju
+Pjx1cmxzPjxyZWxhdGVkLXVybHM+PHVybD5odHRwczovL2RvaS5vcmcvMTAuMTA5My9qYXMvc2th
+ZTM0NjwvdXJsPjwvcmVsYXRlZC11cmxzPjwvdXJscz48Y3VzdG9tMT5za2FlMzQ2PC9jdXN0b20x
+PjxlbGVjdHJvbmljLXJlc291cmNlLW51bT4xMC4xMDkzL2phcy9za2FlMzQ2PC9lbGVjdHJvbmlj
+LXJlc291cmNlLW51bT48YWNjZXNzLWRhdGU+Mi8yNy8yMDI1PC9hY2Nlc3MtZGF0ZT48L3JlY29y
+ZD48L0NpdGU+PENpdGU+PEF1dGhvcj5TbWl0aDwvQXV0aG9yPjxZZWFyPjIwMjE8L1llYXI+PFJl
+Y051bT43OTwvUmVjTnVtPjxyZWNvcmQ+PHJlYy1udW1iZXI+Nzk8L3JlYy1udW1iZXI+PGZvcmVp
+Z24ta2V5cz48a2V5IGFwcD0iRU4iIGRiLWlkPSJ3YXh3enBycGRzNWY5ZGVzNXpkeGE1NWp6c3Bw
+eDU1ZnB3MjAiIHRpbWVzdGFtcD0iMTc0MTc4MjYwOSI+Nzk8L2tleT48L2ZvcmVpZ24ta2V5cz48
+cmVmLXR5cGUgbmFtZT0iSm91cm5hbCBBcnRpY2xlIj4xNzwvcmVmLXR5cGU+PGNvbnRyaWJ1dG9y
+cz48YXV0aG9ycz48YXV0aG9yPlNtaXRoLCBQYXVsIEU8L2F1dGhvcj48YXV0aG9yPldhdGVycywg
+U2luZWFkIE08L2F1dGhvcj48YXV0aG9yPktlbm55LCBEYXZpZCBBPC9hdXRob3I+PGF1dGhvcj5L
+aXJ3YW4sIFN0dWFydCBGPC9hdXRob3I+PGF1dGhvcj5Db25yb3ksIFN0ZXBoZW48L2F1dGhvcj48
+YXV0aG9yPktlbGx5LCBBbGFuIEs8L2F1dGhvcj48L2F1dGhvcnM+PC9jb250cmlidXRvcnM+PHRp
+dGxlcz48dGl0bGU+RWZmZWN0IG9mIGRpdmVyZ2VuY2UgaW4gcmVzaWR1YWwgbWV0aGFuZSBlbWlz
+c2lvbnMgb24gZmVlZCBpbnRha2UgYW5kIGVmZmljaWVuY3ksIGdyb3d0aCBhbmQgY2FyY2FzcyBw
+ZXJmb3JtYW5jZSwgYW5kIGluZGljZXMgb2YgcnVtZW4gZmVybWVudGF0aW9uIGFuZCBtZXRoYW5l
+IGVtaXNzaW9ucyBpbiBmaW5pc2hpbmcgYmVlZiBjYXR0bGU8L3RpdGxlPjxzZWNvbmRhcnktdGl0
+bGU+Sm91cm5hbCBvZiBBbmltYWwgU2NpZW5jZTwvc2Vjb25kYXJ5LXRpdGxlPjwvdGl0bGVzPjxw
+ZXJpb2RpY2FsPjxmdWxsLXRpdGxlPkpvdXJuYWwgb2YgQW5pbWFsIFNjaWVuY2U8L2Z1bGwtdGl0
+bGU+PC9wZXJpb2RpY2FsPjx2b2x1bWU+OTk8L3ZvbHVtZT48bnVtYmVyPjExPC9udW1iZXI+PGRh
+dGVzPjx5ZWFyPjIwMjE8L3llYXI+PC9kYXRlcz48aXNibj4xNTI1LTMxNjM8L2lzYm4+PHVybHM+
+PHJlbGF0ZWQtdXJscz48dXJsPmh0dHBzOi8vZG9pLm9yZy8xMC4xMDkzL2phcy9za2FiMjc1PC91
+cmw+PC9yZWxhdGVkLXVybHM+PC91cmxzPjxjdXN0b20xPnNrYWIyNzU8L2N1c3RvbTE+PGVsZWN0
+cm9uaWMtcmVzb3VyY2UtbnVtPjEwLjEwOTMvamFzL3NrYWIyNzU8L2VsZWN0cm9uaWMtcmVzb3Vy
+Y2UtbnVtPjxhY2Nlc3MtZGF0ZT4zLzEyLzIwMjU8L2FjY2Vzcy1kYXRlPjwvcmVjb3JkPjwvQ2l0
+ZT48L0VuZE5vdGU+AG==
 </w:fldData>
         </w:fldChar>
       </w:r>
@@ -11158,15 +10768,7 @@
         <w:fldChar w:fldCharType="end"/>
       </w:r>
       <w:r>
-        <w:t xml:space="preserve">. The adjustment traits used here (MBW, ADG, muscle mass, rumen volume and CO₂) are also biologically </w:t>
-      </w:r>
-      <w:proofErr w:type="gramStart"/>
-      <w:r>
-        <w:t>relevant in their own right</w:t>
-      </w:r>
-      <w:proofErr w:type="gramEnd"/>
-      <w:r>
-        <w:t xml:space="preserve">. Maintenance energy requirements, and hence much of an animal's feed intake, are proportional to metabolic body weight, so MBW captures the size-driven component of intake. Average daily gain describes the rate of growth and muscle mass the product of growth, so methane expressed relative to ADG reflects emissions relative to growth rate, and methane relative to muscle mass approximates emissions per unit of saleable product. Rumen volume reflects fermentative capacity and retention time </w:t>
+        <w:t xml:space="preserve">. The adjustment traits used here (MBW, ADG, muscle mass, rumen volume and CO₂) are also biologically relevant in their own right. Maintenance energy requirements, and hence much of an animal's feed intake, are proportional to metabolic body weight, so MBW captures the size-driven component of intake. Average daily gain describes the rate of growth and muscle mass the product of growth, so methane expressed relative to ADG reflects emissions relative to growth rate, and methane relative to muscle mass approximates emissions per unit of saleable product. Rumen volume reflects fermentative capacity and retention time </w:t>
       </w:r>
       <w:r>
         <w:fldChar w:fldCharType="begin"/>
@@ -11212,15 +10814,7 @@
       </w:r>
       <w:r>
         <w:lastRenderedPageBreak/>
-        <w:t xml:space="preserve">However, as shown below, scaling or </w:t>
-      </w:r>
-      <w:proofErr w:type="spellStart"/>
-      <w:r>
-        <w:t>residualising</w:t>
-      </w:r>
-      <w:proofErr w:type="spellEnd"/>
-      <w:r>
-        <w:t xml:space="preserve"> methane on these proxies did not remove its genetic association with body size and growth.</w:t>
+        <w:t>However, as shown below, scaling or residualising methane on these proxies did not remove its genetic association with body size and growth.</w:t>
       </w:r>
     </w:p>
     <w:p>
@@ -11414,12 +11008,13 @@
 YyBNZXRoYW5lIEVtaXNzaW9ucyBpbiBJbmRvb3ItRmVkIEdyb3dpbmcgQ2F0dGxlPC90aXRsZT48
 c2Vjb25kYXJ5LXRpdGxlPkpvdXJuYWwgb2YgQW5pbWFsIFNjaWVuY2U8L3NlY29uZGFyeS10aXRs
 ZT48L3RpdGxlcz48cGVyaW9kaWNhbD48ZnVsbC10aXRsZT5Kb3VybmFsIG9mIEFuaW1hbCBTY2ll
-bmNlPC9mdWxsLXRpdGxlPjwvcGVyaW9kaWNhbD48ZGF0ZXM+PHllYXI+MjAyNjwveWVhcj48L2Rh
-dGVzPjxpc2JuPjE1MjUtMzE2MzwvaXNibj48dXJscz48cmVsYXRlZC11cmxzPjx1cmw+aHR0cHM6
-Ly9kb2kub3JnLzEwLjEwOTMvamFzL3NrYWcwNDY8L3VybD48L3JlbGF0ZWQtdXJscz48L3VybHM+
-PGN1c3RvbTE+c2thZzA0NjwvY3VzdG9tMT48ZWxlY3Ryb25pYy1yZXNvdXJjZS1udW0+MTAuMTA5
-My9qYXMvc2thZzA0NjwvZWxlY3Ryb25pYy1yZXNvdXJjZS1udW0+PGFjY2Vzcy1kYXRlPjIvMjUv
-MjAyNjwvYWNjZXNzLWRhdGU+PC9yZWNvcmQ+PC9DaXRlPjwvRW5kTm90ZT5=
+bmNlPC9mdWxsLXRpdGxlPjwvcGVyaW9kaWNhbD48cGFnZXM+c2thZzA0NjwvcGFnZXM+PHZvbHVt
+ZT4xMDQ8L3ZvbHVtZT48ZGF0ZXM+PHllYXI+MjAyNjwveWVhcj48L2RhdGVzPjxpc2JuPjE1MjUt
+MzE2MzwvaXNibj48dXJscz48cmVsYXRlZC11cmxzPjx1cmw+aHR0cHM6Ly9kb2kub3JnLzEwLjEw
+OTMvamFzL3NrYWcwNDY8L3VybD48L3JlbGF0ZWQtdXJscz48L3VybHM+PGN1c3RvbTE+c2thZzA0
+NjwvY3VzdG9tMT48ZWxlY3Ryb25pYy1yZXNvdXJjZS1udW0+MTAuMTA5My9qYXMvc2thZzA0Njwv
+ZWxlY3Ryb25pYy1yZXNvdXJjZS1udW0+PGFjY2Vzcy1kYXRlPjIvMjUvMjAyNjwvYWNjZXNzLWRh
+dGU+PC9yZWNvcmQ+PC9DaXRlPjwvRW5kTm90ZT5=
 </w:fldData>
         </w:fldChar>
       </w:r>
@@ -11473,12 +11068,13 @@
 YyBNZXRoYW5lIEVtaXNzaW9ucyBpbiBJbmRvb3ItRmVkIEdyb3dpbmcgQ2F0dGxlPC90aXRsZT48
 c2Vjb25kYXJ5LXRpdGxlPkpvdXJuYWwgb2YgQW5pbWFsIFNjaWVuY2U8L3NlY29uZGFyeS10aXRs
 ZT48L3RpdGxlcz48cGVyaW9kaWNhbD48ZnVsbC10aXRsZT5Kb3VybmFsIG9mIEFuaW1hbCBTY2ll
-bmNlPC9mdWxsLXRpdGxlPjwvcGVyaW9kaWNhbD48ZGF0ZXM+PHllYXI+MjAyNjwveWVhcj48L2Rh
-dGVzPjxpc2JuPjE1MjUtMzE2MzwvaXNibj48dXJscz48cmVsYXRlZC11cmxzPjx1cmw+aHR0cHM6
-Ly9kb2kub3JnLzEwLjEwOTMvamFzL3NrYWcwNDY8L3VybD48L3JlbGF0ZWQtdXJscz48L3VybHM+
-PGN1c3RvbTE+c2thZzA0NjwvY3VzdG9tMT48ZWxlY3Ryb25pYy1yZXNvdXJjZS1udW0+MTAuMTA5
-My9qYXMvc2thZzA0NjwvZWxlY3Ryb25pYy1yZXNvdXJjZS1udW0+PGFjY2Vzcy1kYXRlPjIvMjUv
-MjAyNjwvYWNjZXNzLWRhdGU+PC9yZWNvcmQ+PC9DaXRlPjwvRW5kTm90ZT5=
+bmNlPC9mdWxsLXRpdGxlPjwvcGVyaW9kaWNhbD48cGFnZXM+c2thZzA0NjwvcGFnZXM+PHZvbHVt
+ZT4xMDQ8L3ZvbHVtZT48ZGF0ZXM+PHllYXI+MjAyNjwveWVhcj48L2RhdGVzPjxpc2JuPjE1MjUt
+MzE2MzwvaXNibj48dXJscz48cmVsYXRlZC11cmxzPjx1cmw+aHR0cHM6Ly9kb2kub3JnLzEwLjEw
+OTMvamFzL3NrYWcwNDY8L3VybD48L3JlbGF0ZWQtdXJscz48L3VybHM+PGN1c3RvbTE+c2thZzA0
+NjwvY3VzdG9tMT48ZWxlY3Ryb25pYy1yZXNvdXJjZS1udW0+MTAuMTA5My9qYXMvc2thZzA0Njwv
+ZWxlY3Ryb25pYy1yZXNvdXJjZS1udW0+PGFjY2Vzcy1kYXRlPjIvMjUvMjAyNjwvYWNjZXNzLWRh
+dGU+PC9yZWNvcmQ+PC9DaXRlPjwvRW5kTm90ZT5=
 </w:fldData>
         </w:fldChar>
       </w:r>
@@ -11661,15 +11257,7 @@
         <w:fldChar w:fldCharType="end"/>
       </w:r>
       <w:r>
-        <w:t xml:space="preserve">, with the highest beef estimates from </w:t>
-      </w:r>
-      <w:proofErr w:type="spellStart"/>
-      <w:r>
-        <w:t>GreenFeed</w:t>
-      </w:r>
-      <w:proofErr w:type="spellEnd"/>
-      <w:r>
-        <w:t xml:space="preserve"> measurements averaged over a full test period </w:t>
+        <w:t xml:space="preserve">, with the highest beef estimates from GreenFeed measurements averaged over a full test period </w:t>
       </w:r>
       <w:r>
         <w:fldChar w:fldCharType="begin">
@@ -11718,12 +11306,13 @@
 YyBNZXRoYW5lIEVtaXNzaW9ucyBpbiBJbmRvb3ItRmVkIEdyb3dpbmcgQ2F0dGxlPC90aXRsZT48
 c2Vjb25kYXJ5LXRpdGxlPkpvdXJuYWwgb2YgQW5pbWFsIFNjaWVuY2U8L3NlY29uZGFyeS10aXRs
 ZT48L3RpdGxlcz48cGVyaW9kaWNhbD48ZnVsbC10aXRsZT5Kb3VybmFsIG9mIEFuaW1hbCBTY2ll
-bmNlPC9mdWxsLXRpdGxlPjwvcGVyaW9kaWNhbD48ZGF0ZXM+PHllYXI+MjAyNjwveWVhcj48L2Rh
-dGVzPjxpc2JuPjE1MjUtMzE2MzwvaXNibj48dXJscz48cmVsYXRlZC11cmxzPjx1cmw+aHR0cHM6
-Ly9kb2kub3JnLzEwLjEwOTMvamFzL3NrYWcwNDY8L3VybD48L3JlbGF0ZWQtdXJscz48L3VybHM+
-PGN1c3RvbTE+c2thZzA0NjwvY3VzdG9tMT48ZWxlY3Ryb25pYy1yZXNvdXJjZS1udW0+MTAuMTA5
-My9qYXMvc2thZzA0NjwvZWxlY3Ryb25pYy1yZXNvdXJjZS1udW0+PGFjY2Vzcy1kYXRlPjIvMjUv
-MjAyNjwvYWNjZXNzLWRhdGU+PC9yZWNvcmQ+PC9DaXRlPjwvRW5kTm90ZT5=
+bmNlPC9mdWxsLXRpdGxlPjwvcGVyaW9kaWNhbD48cGFnZXM+c2thZzA0NjwvcGFnZXM+PHZvbHVt
+ZT4xMDQ8L3ZvbHVtZT48ZGF0ZXM+PHllYXI+MjAyNjwveWVhcj48L2RhdGVzPjxpc2JuPjE1MjUt
+MzE2MzwvaXNibj48dXJscz48cmVsYXRlZC11cmxzPjx1cmw+aHR0cHM6Ly9kb2kub3JnLzEwLjEw
+OTMvamFzL3NrYWcwNDY8L3VybD48L3JlbGF0ZWQtdXJscz48L3VybHM+PGN1c3RvbTE+c2thZzA0
+NjwvY3VzdG9tMT48ZWxlY3Ryb25pYy1yZXNvdXJjZS1udW0+MTAuMTA5My9qYXMvc2thZzA0Njwv
+ZWxlY3Ryb25pYy1yZXNvdXJjZS1udW0+PGFjY2Vzcy1kYXRlPjIvMjUvMjAyNjwvYWNjZXNzLWRh
+dGU+PC9yZWNvcmQ+PC9DaXRlPjwvRW5kTm90ZT5=
 </w:fldData>
         </w:fldChar>
       </w:r>
@@ -11777,12 +11366,13 @@
 YyBNZXRoYW5lIEVtaXNzaW9ucyBpbiBJbmRvb3ItRmVkIEdyb3dpbmcgQ2F0dGxlPC90aXRsZT48
 c2Vjb25kYXJ5LXRpdGxlPkpvdXJuYWwgb2YgQW5pbWFsIFNjaWVuY2U8L3NlY29uZGFyeS10aXRs
 ZT48L3RpdGxlcz48cGVyaW9kaWNhbD48ZnVsbC10aXRsZT5Kb3VybmFsIG9mIEFuaW1hbCBTY2ll
-bmNlPC9mdWxsLXRpdGxlPjwvcGVyaW9kaWNhbD48ZGF0ZXM+PHllYXI+MjAyNjwveWVhcj48L2Rh
-dGVzPjxpc2JuPjE1MjUtMzE2MzwvaXNibj48dXJscz48cmVsYXRlZC11cmxzPjx1cmw+aHR0cHM6
-Ly9kb2kub3JnLzEwLjEwOTMvamFzL3NrYWcwNDY8L3VybD48L3JlbGF0ZWQtdXJscz48L3VybHM+
-PGN1c3RvbTE+c2thZzA0NjwvY3VzdG9tMT48ZWxlY3Ryb25pYy1yZXNvdXJjZS1udW0+MTAuMTA5
-My9qYXMvc2thZzA0NjwvZWxlY3Ryb25pYy1yZXNvdXJjZS1udW0+PGFjY2Vzcy1kYXRlPjIvMjUv
-MjAyNjwvYWNjZXNzLWRhdGU+PC9yZWNvcmQ+PC9DaXRlPjwvRW5kTm90ZT5=
+bmNlPC9mdWxsLXRpdGxlPjwvcGVyaW9kaWNhbD48cGFnZXM+c2thZzA0NjwvcGFnZXM+PHZvbHVt
+ZT4xMDQ8L3ZvbHVtZT48ZGF0ZXM+PHllYXI+MjAyNjwveWVhcj48L2RhdGVzPjxpc2JuPjE1MjUt
+MzE2MzwvaXNibj48dXJscz48cmVsYXRlZC11cmxzPjx1cmw+aHR0cHM6Ly9kb2kub3JnLzEwLjEw
+OTMvamFzL3NrYWcwNDY8L3VybD48L3JlbGF0ZWQtdXJscz48L3VybHM+PGN1c3RvbTE+c2thZzA0
+NjwvY3VzdG9tMT48ZWxlY3Ryb25pYy1yZXNvdXJjZS1udW0+MTAuMTA5My9qYXMvc2thZzA0Njwv
+ZWxlY3Ryb25pYy1yZXNvdXJjZS1udW0+PGFjY2Vzcy1kYXRlPjIvMjUvMjAyNjwvYWNjZXNzLWRh
+dGU+PC9yZWNvcmQ+PC9DaXRlPjwvRW5kTm90ZT5=
 </w:fldData>
         </w:fldChar>
       </w:r>
@@ -12116,12 +11706,13 @@
 cmljIE1ldGhhbmUgRW1pc3Npb25zIGluIEluZG9vci1GZWQgR3Jvd2luZyBDYXR0bGU8L3RpdGxl
 PjxzZWNvbmRhcnktdGl0bGU+Sm91cm5hbCBvZiBBbmltYWwgU2NpZW5jZTwvc2Vjb25kYXJ5LXRp
 dGxlPjwvdGl0bGVzPjxwZXJpb2RpY2FsPjxmdWxsLXRpdGxlPkpvdXJuYWwgb2YgQW5pbWFsIFNj
-aWVuY2U8L2Z1bGwtdGl0bGU+PC9wZXJpb2RpY2FsPjxkYXRlcz48eWVhcj4yMDI2PC95ZWFyPjwv
-ZGF0ZXM+PGlzYm4+MTUyNS0zMTYzPC9pc2JuPjx1cmxzPjxyZWxhdGVkLXVybHM+PHVybD5odHRw
-czovL2RvaS5vcmcvMTAuMTA5My9qYXMvc2thZzA0NjwvdXJsPjwvcmVsYXRlZC11cmxzPjwvdXJs
-cz48Y3VzdG9tMT5za2FnMDQ2PC9jdXN0b20xPjxlbGVjdHJvbmljLXJlc291cmNlLW51bT4xMC4x
-MDkzL2phcy9za2FnMDQ2PC9lbGVjdHJvbmljLXJlc291cmNlLW51bT48YWNjZXNzLWRhdGU+Mi8y
-NS8yMDI2PC9hY2Nlc3MtZGF0ZT48L3JlY29yZD48L0NpdGU+PC9FbmROb3RlPn==
+aWVuY2U8L2Z1bGwtdGl0bGU+PC9wZXJpb2RpY2FsPjxwYWdlcz5za2FnMDQ2PC9wYWdlcz48dm9s
+dW1lPjEwNDwvdm9sdW1lPjxkYXRlcz48eWVhcj4yMDI2PC95ZWFyPjwvZGF0ZXM+PGlzYm4+MTUy
+NS0zMTYzPC9pc2JuPjx1cmxzPjxyZWxhdGVkLXVybHM+PHVybD5odHRwczovL2RvaS5vcmcvMTAu
+MTA5My9qYXMvc2thZzA0NjwvdXJsPjwvcmVsYXRlZC11cmxzPjwvdXJscz48Y3VzdG9tMT5za2Fn
+MDQ2PC9jdXN0b20xPjxlbGVjdHJvbmljLXJlc291cmNlLW51bT4xMC4xMDkzL2phcy9za2FnMDQ2
+PC9lbGVjdHJvbmljLXJlc291cmNlLW51bT48YWNjZXNzLWRhdGU+Mi8yNS8yMDI2PC9hY2Nlc3Mt
+ZGF0ZT48L3JlY29yZD48L0NpdGU+PC9FbmROb3RlPn==
 </w:fldData>
         </w:fldChar>
       </w:r>
@@ -12185,12 +11776,13 @@
 cmljIE1ldGhhbmUgRW1pc3Npb25zIGluIEluZG9vci1GZWQgR3Jvd2luZyBDYXR0bGU8L3RpdGxl
 PjxzZWNvbmRhcnktdGl0bGU+Sm91cm5hbCBvZiBBbmltYWwgU2NpZW5jZTwvc2Vjb25kYXJ5LXRp
 dGxlPjwvdGl0bGVzPjxwZXJpb2RpY2FsPjxmdWxsLXRpdGxlPkpvdXJuYWwgb2YgQW5pbWFsIFNj
-aWVuY2U8L2Z1bGwtdGl0bGU+PC9wZXJpb2RpY2FsPjxkYXRlcz48eWVhcj4yMDI2PC95ZWFyPjwv
-ZGF0ZXM+PGlzYm4+MTUyNS0zMTYzPC9pc2JuPjx1cmxzPjxyZWxhdGVkLXVybHM+PHVybD5odHRw
-czovL2RvaS5vcmcvMTAuMTA5My9qYXMvc2thZzA0NjwvdXJsPjwvcmVsYXRlZC11cmxzPjwvdXJs
-cz48Y3VzdG9tMT5za2FnMDQ2PC9jdXN0b20xPjxlbGVjdHJvbmljLXJlc291cmNlLW51bT4xMC4x
-MDkzL2phcy9za2FnMDQ2PC9lbGVjdHJvbmljLXJlc291cmNlLW51bT48YWNjZXNzLWRhdGU+Mi8y
-NS8yMDI2PC9hY2Nlc3MtZGF0ZT48L3JlY29yZD48L0NpdGU+PC9FbmROb3RlPn==
+aWVuY2U8L2Z1bGwtdGl0bGU+PC9wZXJpb2RpY2FsPjxwYWdlcz5za2FnMDQ2PC9wYWdlcz48dm9s
+dW1lPjEwNDwvdm9sdW1lPjxkYXRlcz48eWVhcj4yMDI2PC95ZWFyPjwvZGF0ZXM+PGlzYm4+MTUy
+NS0zMTYzPC9pc2JuPjx1cmxzPjxyZWxhdGVkLXVybHM+PHVybD5odHRwczovL2RvaS5vcmcvMTAu
+MTA5My9qYXMvc2thZzA0NjwvdXJsPjwvcmVsYXRlZC11cmxzPjwvdXJscz48Y3VzdG9tMT5za2Fn
+MDQ2PC9jdXN0b20xPjxlbGVjdHJvbmljLXJlc291cmNlLW51bT4xMC4xMDkzL2phcy9za2FnMDQ2
+PC9lbGVjdHJvbmljLXJlc291cmNlLW51bT48YWNjZXNzLWRhdGU+Mi8yNS8yMDI2PC9hY2Nlc3Mt
+ZGF0ZT48L3JlY29yZD48L0NpdGU+PC9FbmROb3RlPn==
 </w:fldData>
         </w:fldChar>
       </w:r>
@@ -12233,67 +11825,11 @@
         <w:jc w:val="both"/>
       </w:pPr>
       <w:r>
-        <w:t>Genetically, the alternative methane definitions were strongly correlated with absolute methane in most cases (</w:t>
-      </w:r>
-      <w:proofErr w:type="spellStart"/>
-      <w:r>
-        <w:t>rg</w:t>
-      </w:r>
-      <w:proofErr w:type="spellEnd"/>
-      <w:r>
-        <w:t xml:space="preserve"> = 0.71–1.00), indicating that they share much of the same underlying additive genetic variation rather than capturing a materially distinct trait. Methane per kg of average daily gain (CH₄/ADG) was the most genetically distinct definition (</w:t>
-      </w:r>
-      <w:proofErr w:type="spellStart"/>
-      <w:r>
-        <w:t>rg</w:t>
-      </w:r>
-      <w:proofErr w:type="spellEnd"/>
-      <w:r>
-        <w:t xml:space="preserve"> = 0.38 with absolute methane), consistent with the ratio being dominated by its small and highly variable denominator, ADG (</w:t>
-      </w:r>
-      <w:proofErr w:type="spellStart"/>
-      <w:r>
-        <w:t>rg</w:t>
-      </w:r>
-      <w:proofErr w:type="spellEnd"/>
-      <w:r>
-        <w:t xml:space="preserve"> = −0.81), which is also estimated over a window of up to ±120 days rather than at the time of the methane measurement. Daily methane was also strongly and positively genetically correlated with body size and growth: metabolic body weight (</w:t>
-      </w:r>
-      <w:proofErr w:type="spellStart"/>
-      <w:r>
-        <w:t>rg</w:t>
-      </w:r>
-      <w:proofErr w:type="spellEnd"/>
-      <w:r>
-        <w:t xml:space="preserve"> = 0.72), live weight (</w:t>
-      </w:r>
-      <w:proofErr w:type="spellStart"/>
-      <w:r>
-        <w:t>rg</w:t>
-      </w:r>
-      <w:proofErr w:type="spellEnd"/>
-      <w:r>
-        <w:t xml:space="preserve"> = 0.71), and average daily gain (</w:t>
-      </w:r>
-      <w:proofErr w:type="spellStart"/>
-      <w:r>
-        <w:t>rg</w:t>
-      </w:r>
-      <w:proofErr w:type="spellEnd"/>
-      <w:r>
-        <w:t xml:space="preserve"> = 0.51). Ratio and residual methane traits did not remove these genetic relationships. Methane intensity and the residual methane traits were negatively genetically correlated with their own denominator or adjustment trait, while </w:t>
+        <w:t xml:space="preserve">Genetically, the alternative methane definitions were strongly correlated with absolute methane in most cases (rg = 0.71–1.00), indicating that they share much of the same underlying additive genetic variation rather than capturing a materially distinct trait. Methane per kg of average daily gain (CH₄/ADG) was the most genetically distinct definition (rg = 0.38 with absolute methane), consistent with the ratio being dominated by its small and highly variable denominator, ADG (rg = −0.81), which is also estimated over a window of up to ±120 days rather than at the time of the methane measurement. Daily methane was also strongly and positively genetically correlated with body size and growth: metabolic body weight (rg = 0.72), live weight (rg = 0.71), and average daily gain (rg = 0.51). Ratio and residual methane traits did not remove these genetic relationships. Methane intensity and the residual methane traits were negatively genetically correlated with their own denominator or adjustment trait, while </w:t>
       </w:r>
       <w:r>
         <w:lastRenderedPageBreak/>
-        <w:t>remaining strongly genetically correlated with absolute methane itself (</w:t>
-      </w:r>
-      <w:proofErr w:type="spellStart"/>
-      <w:r>
-        <w:t>rg</w:t>
-      </w:r>
-      <w:proofErr w:type="spellEnd"/>
-      <w:r>
-        <w:t xml:space="preserve"> = 0.78–1.00 for the three residual traits). This is consistent with the general statistical behaviour of ratio and residual variables described by Kennedy et al. </w:t>
+        <w:t xml:space="preserve">remaining strongly genetically correlated with absolute methane itself (rg = 0.78–1.00 for the three residual traits). This is consistent with the general statistical behaviour of ratio and residual variables described by Kennedy et al. </w:t>
       </w:r>
       <w:r>
         <w:fldChar w:fldCharType="begin"/>
@@ -12314,15 +11850,7 @@
         <w:fldChar w:fldCharType="end"/>
       </w:r>
       <w:r>
-        <w:t xml:space="preserve"> and </w:t>
-      </w:r>
-      <w:proofErr w:type="spellStart"/>
-      <w:r>
-        <w:t>Kronmal</w:t>
-      </w:r>
-      <w:proofErr w:type="spellEnd"/>
-      <w:r>
-        <w:t xml:space="preserve"> </w:t>
+        <w:t xml:space="preserve"> and Kronmal </w:t>
       </w:r>
       <w:r>
         <w:fldChar w:fldCharType="begin"/>
@@ -12357,23 +11885,7 @@
         <w:jc w:val="both"/>
       </w:pPr>
       <w:r>
-        <w:t>Carbon dioxide production was moderately heritable (h² = 0.25) and strongly genetically correlated with both daily methane (</w:t>
-      </w:r>
-      <w:proofErr w:type="spellStart"/>
-      <w:r>
-        <w:t>rg</w:t>
-      </w:r>
-      <w:proofErr w:type="spellEnd"/>
-      <w:r>
-        <w:t xml:space="preserve"> = 0.57 ± 0.04) and metabolic body weight (</w:t>
-      </w:r>
-      <w:proofErr w:type="spellStart"/>
-      <w:r>
-        <w:t>rg</w:t>
-      </w:r>
-      <w:proofErr w:type="spellEnd"/>
-      <w:r>
-        <w:t xml:space="preserve"> = 0.83 ± 0.02). CO₂ output reflects total heat production and hence energy intake, and CO₂ is strongly correlated with feed intake in PAC-measured sheep </w:t>
+        <w:t xml:space="preserve">Carbon dioxide production was moderately heritable (h² = 0.25) and strongly genetically correlated with both daily methane (rg = 0.57 ± 0.04) and metabolic body weight (rg = 0.83 ± 0.02). CO₂ output reflects total heat production and hence energy intake, and CO₂ is strongly correlated with feed intake in PAC-measured sheep </w:t>
       </w:r>
       <w:r>
         <w:fldChar w:fldCharType="begin">
@@ -12821,7 +12333,7 @@
       </w:r>
       <w:r>
         <w:fldChar w:fldCharType="begin">
-          <w:fldData xml:space="preserve">PEVuZE5vdGU+PENpdGU+PEF1dGhvcj5Hb29weTwvQXV0aG9yPjxZZWFyPjIwMTU8L1llYXI+PFJl
+          <w:fldData xml:space="preserve">PEVuZE5vdGU+PENpdGU+PEF1dGhvcj5Hb29weTwvQXV0aG9yPjxZZWFyPjIwMTY8L1llYXI+PFJl
 Y051bT4yMzA8L1JlY051bT48RGlzcGxheVRleHQ+WzEyLCAxM108L0Rpc3BsYXlUZXh0PjxyZWNv
 cmQ+PHJlYy1udW1iZXI+MjMwPC9yZWMtbnVtYmVyPjxmb3JlaWduLWtleXM+PGtleSBhcHA9IkVO
 IiBkYi1pZD0id2F4d3pwcnBkczVmOWRlczV6ZHhhNTVqenNwcHg1NWZwdzIwIiB0aW1lc3RhbXA9
@@ -12837,7 +12349,7 @@
 UHJvZHVjdGlvbiBTY2llbmNlPC9zZWNvbmRhcnktdGl0bGU+PC90aXRsZXM+PHBlcmlvZGljYWw+
 PGZ1bGwtdGl0bGU+QW5pbWFsIFByb2R1Y3Rpb24gU2NpZW5jZTwvZnVsbC10aXRsZT48L3Blcmlv
 ZGljYWw+PHBhZ2VzPjExNi0xMjI8L3BhZ2VzPjx2b2x1bWU+NTY8L3ZvbHVtZT48ZGF0ZXM+PHll
-YXI+MjAxNTwveWVhcj48cHViLWRhdGVzPjxkYXRlPjAyLzEyPC9kYXRlPjwvcHViLWRhdGVzPjwv
+YXI+MjAxNjwveWVhcj48cHViLWRhdGVzPjxkYXRlPjAyLzEyPC9kYXRlPjwvcHViLWRhdGVzPjwv
 ZGF0ZXM+PHVybHM+PC91cmxzPjxlbGVjdHJvbmljLXJlc291cmNlLW51bT4xMC4xMDcxL0FOMTMz
 NzA8L2VsZWN0cm9uaWMtcmVzb3VyY2UtbnVtPjwvcmVjb3JkPjwvQ2l0ZT48Q2l0ZT48QXV0aG9y
 PlJvYmluc29uPC9BdXRob3I+PFllYXI+MjAxNTwvWWVhcj48UmVjTnVtPjI3ODwvUmVjTnVtPjxy
@@ -12867,7 +12379,7 @@
       </w:r>
       <w:r>
         <w:fldChar w:fldCharType="begin">
-          <w:fldData xml:space="preserve">PEVuZE5vdGU+PENpdGU+PEF1dGhvcj5Hb29weTwvQXV0aG9yPjxZZWFyPjIwMTU8L1llYXI+PFJl
+          <w:fldData xml:space="preserve">PEVuZE5vdGU+PENpdGU+PEF1dGhvcj5Hb29weTwvQXV0aG9yPjxZZWFyPjIwMTY8L1llYXI+PFJl
 Y051bT4yMzA8L1JlY051bT48RGlzcGxheVRleHQ+WzEyLCAxM108L0Rpc3BsYXlUZXh0PjxyZWNv
 cmQ+PHJlYy1udW1iZXI+MjMwPC9yZWMtbnVtYmVyPjxmb3JlaWduLWtleXM+PGtleSBhcHA9IkVO
 IiBkYi1pZD0id2F4d3pwcnBkczVmOWRlczV6ZHhhNTVqenNwcHg1NWZwdzIwIiB0aW1lc3RhbXA9
@@ -12883,7 +12395,7 @@
 UHJvZHVjdGlvbiBTY2llbmNlPC9zZWNvbmRhcnktdGl0bGU+PC90aXRsZXM+PHBlcmlvZGljYWw+
 PGZ1bGwtdGl0bGU+QW5pbWFsIFByb2R1Y3Rpb24gU2NpZW5jZTwvZnVsbC10aXRsZT48L3Blcmlv
 ZGljYWw+PHBhZ2VzPjExNi0xMjI8L3BhZ2VzPjx2b2x1bWU+NTY8L3ZvbHVtZT48ZGF0ZXM+PHll
-YXI+MjAxNTwveWVhcj48cHViLWRhdGVzPjxkYXRlPjAyLzEyPC9kYXRlPjwvcHViLWRhdGVzPjwv
+YXI+MjAxNjwveWVhcj48cHViLWRhdGVzPjxkYXRlPjAyLzEyPC9kYXRlPjwvcHViLWRhdGVzPjwv
 ZGF0ZXM+PHVybHM+PC91cmxzPjxlbGVjdHJvbmljLXJlc291cmNlLW51bT4xMC4xMDcxL0FOMTMz
 NzA8L2VsZWN0cm9uaWMtcmVzb3VyY2UtbnVtPjwvcmVjb3JkPjwvQ2l0ZT48Q2l0ZT48QXV0aG9y
 PlJvYmluc29uPC9BdXRob3I+PFllYXI+MjAxNTwvWWVhcj48UmVjTnVtPjI3ODwvUmVjTnVtPjxy
@@ -12927,15 +12439,7 @@
         <w:fldChar w:fldCharType="end"/>
       </w:r>
       <w:r>
-        <w:t xml:space="preserve">, and the present data combined animals of very different ages and physiological stages. Accounting for this heterogeneity lowered the heritability of methane, CH₄/MBW, RMTMBW and RMTMBW+CO₂, and of CO₂, relative to a single pooled residual variance (results not shown). </w:t>
-      </w:r>
-      <w:proofErr w:type="gramStart"/>
-      <w:r>
-        <w:t>However</w:t>
-      </w:r>
-      <w:proofErr w:type="gramEnd"/>
-      <w:r>
-        <w:t xml:space="preserve"> classifying the residual variance as either homogeneous or heterogeneous had little impact on the genetic correlations, for example the genetic correlation between methane and methane intensity was 0.85 in the full data, and also 0.85 in both young and mature animals when analysed separately, and the young-versus-mature genetic correlation for methane was 0.99. Residual heterogeneity therefore mainly affects heritability estimates and should be </w:t>
+        <w:t xml:space="preserve">, and the present data combined animals of very different ages and physiological stages. Accounting for this heterogeneity lowered the heritability of methane, CH₄/MBW, RMTMBW and RMTMBW+CO₂, and of CO₂, relative to a single pooled residual variance (results not shown). However classifying the residual variance as either homogeneous or heterogeneous had little impact on the genetic correlations, for example the genetic correlation between methane and methane intensity was 0.85 in the full data, and also 0.85 in both young and mature animals when analysed separately, and the young-versus-mature genetic correlation for methane was 0.99. Residual heterogeneity therefore mainly affects heritability estimates and should be </w:t>
       </w:r>
       <w:r>
         <w:lastRenderedPageBreak/>
@@ -13524,15 +13028,7 @@
         <w:fldChar w:fldCharType="end"/>
       </w:r>
       <w:r>
-        <w:t>. Within the region, the balance can be shifted towards slightly higher body size or intake, as proxied by CO₂, at the cost of a smaller methane reduction; the reference index, which holds both at zero response, is the neutral choice. The weights reported here depend on the genetic parameters and are specific to this population. They were also treated as constant across generations, although genetic parameters change under selection (</w:t>
-      </w:r>
-      <w:proofErr w:type="spellStart"/>
-      <w:r>
-        <w:t>Cuyabano</w:t>
-      </w:r>
-      <w:proofErr w:type="spellEnd"/>
-      <w:r>
-        <w:t xml:space="preserve"> et al. </w:t>
+        <w:t xml:space="preserve">. Within the region, the balance can be shifted towards slightly higher body size or intake, as proxied by CO₂, at the cost of a smaller methane reduction; the reference index, which holds both at zero response, is the neutral choice. The weights reported here depend on the genetic parameters and are specific to this population. They were also treated as constant across generations, although genetic parameters change under selection (Cuyabano et al. </w:t>
       </w:r>
       <w:r>
         <w:fldChar w:fldCharType="begin"/>
@@ -13738,15 +13234,7 @@
         <w:jc w:val="both"/>
       </w:pPr>
       <w:r>
-        <w:t xml:space="preserve">This study estimated genetic parameters for nine alternative methane trait definitions in a large, pasture-based sheep population, and shows that these definitions differ meaningfully in their genetic parameters and in their genetic relationships with body size and growth. All definitions were heritable, with estimates ranging from low to moderate (h² = 0.12–0.46). Ratio and residual methane traits remained strongly genetically correlated with absolute daily methane, showing that they share much of the same underlying genetic variation rather than representing a genetically distinct trait. Daily methane itself was strongly and positively genetically correlated with body size and growth, and scaling or </w:t>
-      </w:r>
-      <w:proofErr w:type="spellStart"/>
-      <w:r>
-        <w:t>residualising</w:t>
-      </w:r>
-      <w:proofErr w:type="spellEnd"/>
-      <w:r>
-        <w:t xml:space="preserve"> methane redistributed this genetic association rather than removing it. When a methane trait is used on its own, the choice of definition therefore determines the direction and magnitude of the genetic relationship between methane and production.</w:t>
+        <w:t>This study estimated genetic parameters for nine alternative methane trait definitions in a large, pasture-based sheep population, and shows that these definitions differ meaningfully in their genetic parameters and in their genetic relationships with body size and growth. All definitions were heritable, with estimates ranging from low to moderate (h² = 0.12–0.46). Ratio and residual methane traits remained strongly genetically correlated with absolute daily methane, showing that they share much of the same underlying genetic variation rather than representing a genetically distinct trait. Daily methane itself was strongly and positively genetically correlated with body size and growth, and scaling or residualising methane redistributed this genetic association rather than removing it. When a methane trait is used on its own, the choice of definition therefore determines the direction and magnitude of the genetic relationship between methane and production.</w:t>
       </w:r>
     </w:p>
     <w:p>
@@ -13758,15 +13246,7 @@
       </w:r>
       <w:r>
         <w:lastRenderedPageBreak/>
-        <w:t xml:space="preserve">weighting of methane, body size and CO₂ in the breeding goal, not the methane trait definition, </w:t>
-      </w:r>
-      <w:proofErr w:type="gramStart"/>
-      <w:r>
-        <w:t>therefore</w:t>
-      </w:r>
-      <w:proofErr w:type="gramEnd"/>
-      <w:r>
-        <w:t xml:space="preserve"> determines whether methane can be reduced without reducing size. In practice these weights would come from economic values, and the same framework identifies the minimum value that must be placed on methane, relative to body size, for an economic index to achieve this.</w:t>
+        <w:t>weighting of methane, body size and CO₂ in the breeding goal, not the methane trait definition, therefore determines whether methane can be reduced without reducing size. In practice these weights would come from economic values, and the same framework identifies the minimum value that must be placed on methane, relative to body size, for an economic index to achieve this.</w:t>
       </w:r>
     </w:p>
     <w:p>
@@ -13838,15 +13318,7 @@
         <w:jc w:val="both"/>
       </w:pPr>
       <w:r>
-        <w:t xml:space="preserve">The datasets analysed in the current study are not publicly available as they contain commercially sensitive information collected from farmers and private enterprises. Supplementary materials, including full variance components and complete correlation matrices, are available via </w:t>
-      </w:r>
-      <w:proofErr w:type="spellStart"/>
-      <w:r>
-        <w:t>Zenodo</w:t>
-      </w:r>
-      <w:proofErr w:type="spellEnd"/>
-      <w:r>
-        <w:t xml:space="preserve"> [DOI to be added upon acceptance].</w:t>
+        <w:t>The datasets analysed in the current study are not publicly available as they contain commercially sensitive information collected from farmers and private enterprises. Supplementary materials, including full variance components and complete correlation matrices, are available via Zenodo [DOI to be added upon acceptance].</w:t>
       </w:r>
     </w:p>
     <w:p>
@@ -13886,31 +13358,7 @@
         <w:jc w:val="both"/>
       </w:pPr>
       <w:r>
-        <w:t xml:space="preserve">Funding from the Irish Department of Agriculture, Food, and Marine </w:t>
-      </w:r>
-      <w:proofErr w:type="spellStart"/>
-      <w:r>
-        <w:t>MethanePredict</w:t>
-      </w:r>
-      <w:proofErr w:type="spellEnd"/>
-      <w:r>
-        <w:t xml:space="preserve"> (2022IRLNZ121), </w:t>
-      </w:r>
-      <w:proofErr w:type="spellStart"/>
-      <w:r>
-        <w:t>SustainSheep</w:t>
-      </w:r>
-      <w:proofErr w:type="spellEnd"/>
-      <w:r>
-        <w:t xml:space="preserve"> (2023GEH253), and Science Foundation Ireland under the Grant 21/FFP-A/9148 (OviSeq) projects </w:t>
-      </w:r>
-      <w:proofErr w:type="gramStart"/>
-      <w:r>
-        <w:t>is</w:t>
-      </w:r>
-      <w:proofErr w:type="gramEnd"/>
-      <w:r>
-        <w:t xml:space="preserve"> gratefully acknowledged.</w:t>
+        <w:t>Funding from the Irish Department of Agriculture, Food, and Marine MethanePredict (2022IRLNZ121), SustainSheep (2023GEH253), and Science Foundation Ireland under the Grant 21/FFP-A/9148 (OviSeq) projects is gratefully acknowledged.</w:t>
       </w:r>
     </w:p>
     <w:p>
@@ -15714,7 +15162,6 @@
             <w:pPr>
               <w:jc w:val="both"/>
             </w:pPr>
-            <w:proofErr w:type="spellStart"/>
             <w:r>
               <w:rPr>
                 <w:b w:val="0"/>
@@ -15722,7 +15169,6 @@
               </w:rPr>
               <w:t>BTg</w:t>
             </w:r>
-            <w:proofErr w:type="spellEnd"/>
           </w:p>
         </w:tc>
         <w:tc>
@@ -15858,7 +15304,6 @@
             <w:pPr>
               <w:jc w:val="both"/>
             </w:pPr>
-            <w:proofErr w:type="spellStart"/>
             <w:r>
               <w:rPr>
                 <w:b w:val="0"/>
@@ -15866,7 +15311,6 @@
               </w:rPr>
               <w:t>RTg</w:t>
             </w:r>
-            <w:proofErr w:type="spellEnd"/>
           </w:p>
         </w:tc>
         <w:tc>
@@ -15999,7 +15443,6 @@
             <w:pPr>
               <w:jc w:val="both"/>
             </w:pPr>
-            <w:proofErr w:type="spellStart"/>
             <w:r>
               <w:rPr>
                 <w:b w:val="0"/>
@@ -16007,7 +15450,6 @@
               </w:rPr>
               <w:t>BTe</w:t>
             </w:r>
-            <w:proofErr w:type="spellEnd"/>
           </w:p>
         </w:tc>
         <w:tc>
@@ -16143,7 +15585,6 @@
             <w:pPr>
               <w:jc w:val="both"/>
             </w:pPr>
-            <w:proofErr w:type="spellStart"/>
             <w:r>
               <w:rPr>
                 <w:b w:val="0"/>
@@ -16151,7 +15592,6 @@
               </w:rPr>
               <w:t>RTe</w:t>
             </w:r>
-            <w:proofErr w:type="spellEnd"/>
           </w:p>
         </w:tc>
         <w:tc>
@@ -16425,23 +15865,7 @@
           <w:sz w:val="20"/>
         </w:rPr>
         <w:lastRenderedPageBreak/>
-        <w:t xml:space="preserve">* P &lt; 0.05; ** P &lt; 0.01; *** P &lt; 0.001; ns, not significant (P ≥ 0.05); –, term not in the model for that trait. Fixed effects as defined in the model equation (Methods); other or unknown breeds is the proportion of breeds other than the six named, fitted as a covariate. Contemporary group (1,435 levels) was fitted in every model but is not shown, as </w:t>
-      </w:r>
-      <w:proofErr w:type="spellStart"/>
-      <w:r>
-        <w:rPr>
-          <w:i/>
-          <w:sz w:val="20"/>
-        </w:rPr>
-        <w:t>ASReml</w:t>
-      </w:r>
-      <w:proofErr w:type="spellEnd"/>
-      <w:r>
-        <w:rPr>
-          <w:i/>
-          <w:sz w:val="20"/>
-        </w:rPr>
-        <w:t xml:space="preserve"> omits factors with this many levels from the Wald table by default.</w:t>
+        <w:t>* P &lt; 0.05; ** P &lt; 0.01; *** P &lt; 0.001; ns, not significant (P ≥ 0.05); –, term not in the model for that trait. Fixed effects as defined in the model equation (Methods); other or unknown breeds is the proportion of breeds other than the six named, fitted as a covariate. Contemporary group (1,435 levels) was fitted in every model but is not shown, as ASReml omits factors with this many levels from the Wald table by default.</w:t>
       </w:r>
     </w:p>
     <w:p>
@@ -16455,15 +15879,7 @@
         <w:t>Table S1b.</w:t>
       </w:r>
       <w:r>
-        <w:t xml:space="preserve"> Pedigree completeness and connectedness of the </w:t>
-      </w:r>
-      <w:proofErr w:type="spellStart"/>
-      <w:r>
-        <w:t>phenotyped</w:t>
-      </w:r>
-      <w:proofErr w:type="spellEnd"/>
-      <w:r>
-        <w:t xml:space="preserve"> animals.</w:t>
+        <w:t xml:space="preserve"> Pedigree completeness and connectedness of the phenotyped animals.</w:t>
       </w:r>
     </w:p>
     <w:tbl>
@@ -16530,21 +15946,12 @@
             <w:pPr>
               <w:jc w:val="both"/>
             </w:pPr>
-            <w:proofErr w:type="spellStart"/>
             <w:r>
               <w:rPr>
                 <w:b w:val="0"/>
                 <w:sz w:val="19"/>
               </w:rPr>
-              <w:t>Phenotyped</w:t>
-            </w:r>
-            <w:proofErr w:type="spellEnd"/>
-            <w:r>
-              <w:rPr>
-                <w:b w:val="0"/>
-                <w:sz w:val="19"/>
-              </w:rPr>
-              <w:t xml:space="preserve"> animals represented in the pedigree</w:t>
+              <w:t>Phenotyped animals represented in the pedigree</w:t>
             </w:r>
           </w:p>
         </w:tc>
@@ -17175,15 +16582,7 @@
         <w:t>S3.</w:t>
       </w:r>
       <w:r>
-        <w:t xml:space="preserve"> Genetic parameters from the </w:t>
-      </w:r>
-      <w:proofErr w:type="spellStart"/>
-      <w:r>
-        <w:t>trivariate</w:t>
-      </w:r>
-      <w:proofErr w:type="spellEnd"/>
-      <w:r>
-        <w:t xml:space="preserve"> analysis of CH₄, MBW and CO₂ used in the selection index analysis.</w:t>
+        <w:t xml:space="preserve"> Genetic parameters from the trivariate analysis of CH₄, MBW and CO₂ used in the selection index analysis.</w:t>
       </w:r>
     </w:p>
     <w:tbl>
@@ -17251,7 +16650,6 @@
               <w:jc w:val="center"/>
               <w:cnfStyle w:val="100000000000" w:firstRow="1" w:lastRow="0" w:firstColumn="0" w:lastColumn="0" w:oddVBand="0" w:evenVBand="0" w:oddHBand="0" w:evenHBand="0" w:firstRowFirstColumn="0" w:firstRowLastColumn="0" w:lastRowFirstColumn="0" w:lastRowLastColumn="0"/>
             </w:pPr>
-            <w:proofErr w:type="spellStart"/>
             <w:r>
               <w:rPr>
                 <w:b w:val="0"/>
@@ -17259,7 +16657,6 @@
               </w:rPr>
               <w:t>σa</w:t>
             </w:r>
-            <w:proofErr w:type="spellEnd"/>
           </w:p>
         </w:tc>
         <w:tc>
@@ -17271,7 +16668,6 @@
               <w:jc w:val="center"/>
               <w:cnfStyle w:val="100000000000" w:firstRow="1" w:lastRow="0" w:firstColumn="0" w:lastColumn="0" w:oddVBand="0" w:evenVBand="0" w:oddHBand="0" w:evenHBand="0" w:firstRowFirstColumn="0" w:firstRowLastColumn="0" w:lastRowFirstColumn="0" w:lastRowLastColumn="0"/>
             </w:pPr>
-            <w:proofErr w:type="spellStart"/>
             <w:r>
               <w:rPr>
                 <w:b w:val="0"/>
@@ -17279,7 +16675,6 @@
               </w:rPr>
               <w:t>σp</w:t>
             </w:r>
-            <w:proofErr w:type="spellEnd"/>
           </w:p>
         </w:tc>
         <w:tc>
@@ -17309,21 +16704,30 @@
               <w:jc w:val="center"/>
               <w:cnfStyle w:val="100000000000" w:firstRow="1" w:lastRow="0" w:firstColumn="0" w:lastColumn="0" w:oddVBand="0" w:evenVBand="0" w:oddHBand="0" w:evenHBand="0" w:firstRowFirstColumn="0" w:firstRowLastColumn="0" w:lastRowFirstColumn="0" w:lastRowLastColumn="0"/>
             </w:pPr>
-            <w:proofErr w:type="spellStart"/>
             <w:r>
               <w:rPr>
                 <w:b w:val="0"/>
                 <w:sz w:val="19"/>
               </w:rPr>
-              <w:t>rg</w:t>
-            </w:r>
-            <w:proofErr w:type="spellEnd"/>
+              <w:t>rg with CH₄ (SE)</w:t>
+            </w:r>
+          </w:p>
+        </w:tc>
+        <w:tc>
+          <w:tcPr>
+            <w:tcW w:w="1128" w:type="dxa"/>
+          </w:tcPr>
+          <w:p>
+            <w:pPr>
+              <w:jc w:val="center"/>
+              <w:cnfStyle w:val="100000000000" w:firstRow="1" w:lastRow="0" w:firstColumn="0" w:lastColumn="0" w:oddVBand="0" w:evenVBand="0" w:oddHBand="0" w:evenHBand="0" w:firstRowFirstColumn="0" w:firstRowLastColumn="0" w:lastRowFirstColumn="0" w:lastRowLastColumn="0"/>
+            </w:pPr>
             <w:r>
               <w:rPr>
                 <w:b w:val="0"/>
                 <w:sz w:val="19"/>
               </w:rPr>
-              <w:t xml:space="preserve"> with CH₄ (SE)</w:t>
+              <w:t>rg with MBW (SE)</w:t>
             </w:r>
           </w:p>
         </w:tc>
@@ -17336,48 +16740,12 @@
               <w:jc w:val="center"/>
               <w:cnfStyle w:val="100000000000" w:firstRow="1" w:lastRow="0" w:firstColumn="0" w:lastColumn="0" w:oddVBand="0" w:evenVBand="0" w:oddHBand="0" w:evenHBand="0" w:firstRowFirstColumn="0" w:firstRowLastColumn="0" w:lastRowFirstColumn="0" w:lastRowLastColumn="0"/>
             </w:pPr>
-            <w:proofErr w:type="spellStart"/>
             <w:r>
               <w:rPr>
                 <w:b w:val="0"/>
                 <w:sz w:val="19"/>
               </w:rPr>
-              <w:t>rg</w:t>
-            </w:r>
-            <w:proofErr w:type="spellEnd"/>
-            <w:r>
-              <w:rPr>
-                <w:b w:val="0"/>
-                <w:sz w:val="19"/>
-              </w:rPr>
-              <w:t xml:space="preserve"> with MBW (SE)</w:t>
-            </w:r>
-          </w:p>
-        </w:tc>
-        <w:tc>
-          <w:tcPr>
-            <w:tcW w:w="1128" w:type="dxa"/>
-          </w:tcPr>
-          <w:p>
-            <w:pPr>
-              <w:jc w:val="center"/>
-              <w:cnfStyle w:val="100000000000" w:firstRow="1" w:lastRow="0" w:firstColumn="0" w:lastColumn="0" w:oddVBand="0" w:evenVBand="0" w:oddHBand="0" w:evenHBand="0" w:firstRowFirstColumn="0" w:firstRowLastColumn="0" w:lastRowFirstColumn="0" w:lastRowLastColumn="0"/>
-            </w:pPr>
-            <w:proofErr w:type="spellStart"/>
-            <w:r>
-              <w:rPr>
-                <w:b w:val="0"/>
-                <w:sz w:val="19"/>
-              </w:rPr>
-              <w:t>rg</w:t>
-            </w:r>
-            <w:proofErr w:type="spellEnd"/>
-            <w:r>
-              <w:rPr>
-                <w:b w:val="0"/>
-                <w:sz w:val="19"/>
-              </w:rPr>
-              <w:t xml:space="preserve"> with CO₂ (SE)</w:t>
+              <w:t>rg with CO₂ (SE)</w:t>
             </w:r>
           </w:p>
         </w:tc>
@@ -17811,53 +17179,12 @@
       <w:pPr>
         <w:jc w:val="both"/>
       </w:pPr>
-      <w:proofErr w:type="spellStart"/>
       <w:r>
         <w:rPr>
           <w:i/>
           <w:sz w:val="20"/>
         </w:rPr>
-        <w:t>σa</w:t>
-      </w:r>
-      <w:proofErr w:type="spellEnd"/>
-      <w:r>
-        <w:rPr>
-          <w:i/>
-          <w:sz w:val="20"/>
-        </w:rPr>
-        <w:t xml:space="preserve"> and </w:t>
-      </w:r>
-      <w:proofErr w:type="spellStart"/>
-      <w:r>
-        <w:rPr>
-          <w:i/>
-          <w:sz w:val="20"/>
-        </w:rPr>
-        <w:t>σp</w:t>
-      </w:r>
-      <w:proofErr w:type="spellEnd"/>
-      <w:r>
-        <w:rPr>
-          <w:i/>
-          <w:sz w:val="20"/>
-        </w:rPr>
-        <w:t xml:space="preserve"> are genetic and phenotypic standard deviations from the fitted variance components; </w:t>
-      </w:r>
-      <w:proofErr w:type="spellStart"/>
-      <w:r>
-        <w:rPr>
-          <w:i/>
-          <w:sz w:val="20"/>
-        </w:rPr>
-        <w:t>σp</w:t>
-      </w:r>
-      <w:proofErr w:type="spellEnd"/>
-      <w:r>
-        <w:rPr>
-          <w:i/>
-          <w:sz w:val="20"/>
-        </w:rPr>
-        <w:t xml:space="preserve"> is conditional on the fixed effects. Phenotypic correlations: CH₄–MBW 0.36, CH₄–CO₂ 0.37, MBW–CO₂ 0.50 (SE ≤ 0.01). h² = heritability.</w:t>
+        <w:t>σa and σp are genetic and phenotypic standard deviations from the fitted variance components; σp is conditional on the fixed effects. Phenotypic correlations: CH₄–MBW 0.36, CH₄–CO₂ 0.37, MBW–CO₂ 0.50 (SE ≤ 0.01). h² = heritability.</w:t>
       </w:r>
     </w:p>
     <w:p>
@@ -18201,23 +17528,7 @@
           <w:sz w:val="20"/>
         </w:rPr>
         <w:lastRenderedPageBreak/>
-        <w:t xml:space="preserve">economic values; multiplying all three by a constant gives the same index and responses. Expressed as relative emphasis (index weight × phenotypic standard deviation from the </w:t>
-      </w:r>
-      <w:proofErr w:type="spellStart"/>
-      <w:r>
-        <w:rPr>
-          <w:i/>
-          <w:sz w:val="20"/>
-        </w:rPr>
-        <w:t>trivariate</w:t>
-      </w:r>
-      <w:proofErr w:type="spellEnd"/>
-      <w:r>
-        <w:rPr>
-          <w:i/>
-          <w:sz w:val="20"/>
-        </w:rPr>
-        <w:t xml:space="preserve"> model, as a percentage of the summed absolute values), the index places −68% on CH₄, +32% on MBW and −0.3% on CO₂, identically for all three rows. In each row, the MBW and CO₂ weights are those added on top of any already built into the methane term, which is why they are zero for the genetic residual. Weights are on unscaled phenotypes; the CO₂ weight is numerically small because CO₂ is measured in g day⁻¹.</w:t>
+        <w:t>economic values; multiplying all three by a constant gives the same index and responses. Expressed as relative emphasis (index weight × phenotypic standard deviation from the trivariate model, as a percentage of the summed absolute values), the index places −68% on CH₄, +32% on MBW and −0.3% on CO₂, identically for all three rows. In each row, the MBW and CO₂ weights are those added on top of any already built into the methane term, which is why they are zero for the genetic residual. Weights are on unscaled phenotypes; the CO₂ weight is numerically small because CO₂ is measured in g day⁻¹.</w:t>
       </w:r>
     </w:p>
     <w:p>
@@ -18404,7 +17715,7 @@
       </w:r>
       <w:r>
         <w:tab/>
-        <w:t>Goopy J., Robinson D., Woodgate R., Donaldson A., Oddy V., Vercoe P., Hegarty R., Estimates of repeatability and heritability of methane production in sheep using portable accumulation chambers, Animal Production Science. 56 (2015) 116-122.</w:t>
+        <w:t>Goopy J., Robinson D., Woodgate R., Donaldson A., Oddy V., Vercoe P., Hegarty R., Estimates of repeatability and heritability of methane production in sheep using portable accumulation chambers, Animal Production Science. 56 (2016) 116-122.</w:t>
       </w:r>
     </w:p>
     <w:p>
@@ -18476,7 +17787,7 @@
       </w:r>
       <w:r>
         <w:tab/>
-        <w:t>Crowley S.B., Purfield D.C., Conroy S.B., Kelly D.N., Evans R.D., Ryan C.V., Berry D.P., Associations between a range of enteric methane emission traits and performance traits in indoor-fed growing cattle, Journal of Animal Science. 102 (2024).</w:t>
+        <w:t>Crowley S.B., Purfield D.C., Conroy S.B., Kelly D.N., Evans R.D., Ryan C.V., Berry D.P., Associations between a range of enteric methane emission traits and performance traits in indoor-fed growing cattle, Journal of Animal Science. 102 (2024) skae346.</w:t>
       </w:r>
     </w:p>
     <w:p>
@@ -18488,7 +17799,7 @@
       </w:r>
       <w:r>
         <w:tab/>
-        <w:t>Crowley S.B., Purfield D.C., Conroy S.B., Kelly D.N., Evans R.D., Ryan C.V., Berry D.P., Genetic Insights into Enteric Methane Emissions in Indoor-Fed Growing Cattle, Journal of Animal Science.  (2026).</w:t>
+        <w:t>Crowley S.B., Purfield D.C., Conroy S.B., Kelly D.N., Evans R.D., Ryan C.V., Berry D.P., Genetic Insights into Enteric Methane Emissions in Indoor-Fed Growing Cattle, Journal of Animal Science. 104 (2026) skag046.</w:t>
       </w:r>
     </w:p>
     <w:p>
@@ -18536,7 +17847,7 @@
       </w:r>
       <w:r>
         <w:tab/>
-        <w:t>Kelly D.J., Mchugh N., Purfield D., Mccarron P., Pabiou T., Murphy C., Mcgovern F., Assessing alternative metrics of methane output measured in a multi-breed, pasture-based sheep population, Journal of Animal Science.  (2026).</w:t>
+        <w:t>Kelly D.J., McHugh N., Purfield D., McCarron P., Pabiou T., Murphy C., McGovern F., Assessing alternative metrics of methane output measured in a multi-breed, pasture-based sheep population, Journal of Animal Science. 104 (2026) skag145.</w:t>
       </w:r>
     </w:p>
     <w:p>
@@ -19009,7 +18320,11 @@
       </w:r>
       <w:r>
         <w:tab/>
-        <w:t>Richardson C.M., Amer P.R., Quinton C., Crowley J., Hely F.S., van den Berg I., Pryce J.E., Reducing greenhouse gas emissions through genetic selection in the Australian dairy industry, Journal of Dairy Science. 105 (2022) 4272-4288.</w:t>
+        <w:t>Richardson C.M., Amer P.R., Quinton C., Crowley J., Hely F.S., van den Berg I., Pryce J.E., Reducing greenhouse gas emissions through genetic selection in the Aus</w:t>
+      </w:r>
+      <w:r>
+        <w:lastRenderedPageBreak/>
+        <w:t>tralian dairy industry, Journal of Dairy Science. 105 (2022) 4272-4288.</w:t>
       </w:r>
     </w:p>
     <w:p>
@@ -19017,7 +18332,6 @@
         <w:pStyle w:val="EndNoteBibliography"/>
       </w:pPr>
       <w:r>
-        <w:lastRenderedPageBreak/>
         <w:t>[63]</w:t>
       </w:r>
       <w:r>

</xml_diff>